<commit_message>
MediaReleaseForm added to documentation folder
</commit_message>
<xml_diff>
--- a/source/MySEProject/Documentations/ML 2425-03 Implement Anomaly Detection Sample.docx
+++ b/source/MySEProject/Documentations/ML 2425-03 Implement Anomaly Detection Sample.docx
@@ -7,6 +7,12 @@
         <w:pStyle w:val="papertitle"/>
         <w:spacing w:before="100" w:beforeAutospacing="1" w:after="100" w:afterAutospacing="1"/>
       </w:pPr>
+      <w:r>
+        <w:t>ML24/25-03</w:t>
+      </w:r>
+      <w:r>
+        <w:t xml:space="preserve"> </w:t>
+      </w:r>
       <w:r>
         <w:t>Implement anomaly detection sample</w:t>
       </w:r>
@@ -320,19 +326,11 @@
           <w:lang w:val="en-US"/>
         </w:rPr>
       </w:pPr>
-      <w:proofErr w:type="spellStart"/>
-      <w:r>
-        <w:rPr>
-          <w:lang w:val="en-US"/>
-        </w:rPr>
-        <w:t>Numenta</w:t>
-      </w:r>
-      <w:proofErr w:type="spellEnd"/>
-      <w:r>
-        <w:rPr>
-          <w:lang w:val="en-US"/>
-        </w:rPr>
-        <w:t xml:space="preserve"> has developed Hierarchical Temporal Memory (HTM), a machine intelligence technology with biological constraints. The brain scientist Jeff Hawkins, the founder of the Redwood Neuroscience Research Institute and Sandra Blakeslee, published it in 2004 [1]. It is a Machine Learning approach based on </w:t>
+      <w:r>
+        <w:rPr>
+          <w:lang w:val="en-US"/>
+        </w:rPr>
+        <w:t xml:space="preserve">Numenta has developed Hierarchical Temporal Memory (HTM), a machine intelligence technology with biological constraints. The brain scientist Jeff Hawkins, the founder of the Redwood Neuroscience Research Institute and Sandra Blakeslee, published it in 2004 [1]. It is a Machine Learning approach based on </w:t>
       </w:r>
       <w:r>
         <w:rPr>
@@ -344,21 +342,7 @@
         <w:rPr>
           <w:lang w:val="en-US"/>
         </w:rPr>
-        <w:t xml:space="preserve"> Brains Theory. This technology operates according to a theory about how the biological neocortex works. Mammals only have one area of the brain called the neocortex, which is responsible for higher order processes like language, conscious movement and thought, and sensory perception [2]. We can think of HTM as a particular type of hierarchical Bayesian model. </w:t>
-      </w:r>
-      <w:proofErr w:type="gramStart"/>
-      <w:r>
-        <w:rPr>
-          <w:lang w:val="en-US"/>
-        </w:rPr>
-        <w:t>In order to</w:t>
-      </w:r>
-      <w:proofErr w:type="gramEnd"/>
-      <w:r>
-        <w:rPr>
-          <w:lang w:val="en-US"/>
-        </w:rPr>
-        <w:t xml:space="preserve"> learn the structure and invariance of the space of problems, it also makes use of spatial-temporal theory [3]. In recent years HTM </w:t>
+        <w:t xml:space="preserve"> Brains Theory. This technology operates according to a theory about how the biological neocortex works. Mammals only have one area of the brain called the neocortex, which is responsible for higher order processes like language, conscious movement and thought, and sensory perception [2]. We can think of HTM as a particular type of hierarchical Bayesian model. In order to learn the structure and invariance of the space of problems, it also makes use of spatial-temporal theory [3]. In recent years HTM </w:t>
       </w:r>
       <w:r>
         <w:rPr>
@@ -551,7 +535,6 @@
         </w:rPr>
         <w:t>Below we give our data sequences where the sequences are in JSON files. We keep our dataset in two individual folders which are </w:t>
       </w:r>
-      <w:proofErr w:type="spellStart"/>
       <w:r>
         <w:rPr>
           <w:rStyle w:val="HTMLCode"/>
@@ -568,7 +551,6 @@
         </w:rPr>
         <w:t>sequence</w:t>
       </w:r>
-      <w:proofErr w:type="spellEnd"/>
       <w:r>
         <w:rPr>
           <w:color w:val="1F2328"/>
@@ -577,7 +559,6 @@
         </w:rPr>
         <w:t> (for training data where 4 files) and </w:t>
       </w:r>
-      <w:proofErr w:type="spellStart"/>
       <w:r>
         <w:rPr>
           <w:rStyle w:val="HTMLCode"/>
@@ -594,7 +575,6 @@
         </w:rPr>
         <w:t>sequence</w:t>
       </w:r>
-      <w:proofErr w:type="spellEnd"/>
       <w:r>
         <w:rPr>
           <w:color w:val="1F2328"/>
@@ -848,15 +828,7 @@
         <w:t>Here</w:t>
       </w:r>
       <w:r>
-        <w:t xml:space="preserve"> are also 4 files each file has 5 sequences where each sequence has 10 numerical data (means 10 days temperature value) for training, which </w:t>
-      </w:r>
-      <w:proofErr w:type="gramStart"/>
-      <w:r>
-        <w:t>is located in</w:t>
-      </w:r>
-      <w:proofErr w:type="gramEnd"/>
-      <w:r>
-        <w:t xml:space="preserve"> the training_</w:t>
+        <w:t xml:space="preserve"> are also 4 files each file has 5 sequences where each sequence has 10 numerical data (means 10 days temperature value) for training, which is located in the training_</w:t>
       </w:r>
       <w:r>
         <w:t>sequence</w:t>
@@ -1115,21 +1087,8 @@
                     <w:jc w:val="both"/>
                   </w:pPr>
                   <w:r>
-                    <w:t xml:space="preserve">int </w:t>
-                  </w:r>
-                  <w:proofErr w:type="spellStart"/>
-                  <w:r>
-                    <w:t>inputBits</w:t>
-                  </w:r>
-                  <w:proofErr w:type="spellEnd"/>
-                  <w:r>
-                    <w:t xml:space="preserve"> = </w:t>
-                  </w:r>
-                  <w:proofErr w:type="gramStart"/>
-                  <w:r>
-                    <w:t>121;</w:t>
-                  </w:r>
-                  <w:proofErr w:type="gramEnd"/>
+                    <w:t>int inputBits = 121;</w:t>
+                  </w:r>
                 </w:p>
                 <w:p>
                   <w:pPr>
@@ -1137,21 +1096,8 @@
                     <w:jc w:val="both"/>
                   </w:pPr>
                   <w:r>
-                    <w:t xml:space="preserve">int </w:t>
-                  </w:r>
-                  <w:proofErr w:type="spellStart"/>
-                  <w:r>
-                    <w:t>numColumns</w:t>
-                  </w:r>
-                  <w:proofErr w:type="spellEnd"/>
-                  <w:r>
-                    <w:t xml:space="preserve"> = </w:t>
-                  </w:r>
-                  <w:proofErr w:type="gramStart"/>
-                  <w:r>
-                    <w:t>1210;</w:t>
-                  </w:r>
-                  <w:proofErr w:type="gramEnd"/>
+                    <w:t>int numColumns = 1210;</w:t>
+                  </w:r>
                 </w:p>
                 <w:p>
                   <w:pPr>
@@ -1165,21 +1111,7 @@
                     <w:rPr>
                       <w:color w:val="000000"/>
                     </w:rPr>
-                    <w:t>Dictionary&lt;string, object&gt; settings = new Dictionary&lt;string, object</w:t>
-                  </w:r>
-                  <w:proofErr w:type="gramStart"/>
-                  <w:r>
-                    <w:rPr>
-                      <w:color w:val="000000"/>
-                    </w:rPr>
-                    <w:t>&gt;(</w:t>
-                  </w:r>
-                  <w:proofErr w:type="gramEnd"/>
-                  <w:r>
-                    <w:rPr>
-                      <w:color w:val="000000"/>
-                    </w:rPr>
-                    <w:t>)</w:t>
+                    <w:t>Dictionary&lt;string, object&gt; settings = new Dictionary&lt;string, object&gt;()</w:t>
                   </w:r>
                 </w:p>
                 <w:p>
@@ -1209,21 +1141,7 @@
                     <w:rPr>
                       <w:color w:val="000000"/>
                     </w:rPr>
-                    <w:t xml:space="preserve">                </w:t>
-                  </w:r>
-                  <w:proofErr w:type="gramStart"/>
-                  <w:r>
-                    <w:rPr>
-                      <w:color w:val="000000"/>
-                    </w:rPr>
-                    <w:t>{ "</w:t>
-                  </w:r>
-                  <w:proofErr w:type="gramEnd"/>
-                  <w:r>
-                    <w:rPr>
-                      <w:color w:val="000000"/>
-                    </w:rPr>
-                    <w:t>W", 21},</w:t>
+                    <w:t xml:space="preserve">                { "W", 21},</w:t>
                   </w:r>
                 </w:p>
                 <w:p>
@@ -1238,35 +1156,7 @@
                     <w:rPr>
                       <w:color w:val="000000"/>
                     </w:rPr>
-                    <w:t xml:space="preserve">                </w:t>
-                  </w:r>
-                  <w:proofErr w:type="gramStart"/>
-                  <w:r>
-                    <w:rPr>
-                      <w:color w:val="000000"/>
-                    </w:rPr>
-                    <w:t>{ "</w:t>
-                  </w:r>
-                  <w:proofErr w:type="gramEnd"/>
-                  <w:r>
-                    <w:rPr>
-                      <w:color w:val="000000"/>
-                    </w:rPr>
-                    <w:t xml:space="preserve">N", </w:t>
-                  </w:r>
-                  <w:proofErr w:type="spellStart"/>
-                  <w:r>
-                    <w:rPr>
-                      <w:color w:val="000000"/>
-                    </w:rPr>
-                    <w:t>inputBits</w:t>
-                  </w:r>
-                  <w:proofErr w:type="spellEnd"/>
-                  <w:r>
-                    <w:rPr>
-                      <w:color w:val="000000"/>
-                    </w:rPr>
-                    <w:t>}</w:t>
+                    <w:t xml:space="preserve">                { "N", inputBits}</w:t>
                   </w:r>
                 </w:p>
                 <w:p>
@@ -1311,61 +1201,13 @@
         <w:t xml:space="preserve">The lower and upper bounds of the data are configured to 0 and 100, respectively, under the assumption that all values will fall within this range. It is important to note that these bounds may need adjustment based on the specific input data being used. We have made </w:t>
       </w:r>
       <w:r>
-        <w:t xml:space="preserve">some changes to HTM encoder’s parameters which </w:t>
-      </w:r>
-      <w:proofErr w:type="gramStart"/>
-      <w:r>
-        <w:t>is</w:t>
-      </w:r>
-      <w:proofErr w:type="gramEnd"/>
-      <w:r>
-        <w:t xml:space="preserve"> </w:t>
+        <w:t xml:space="preserve">some changes to HTM encoder’s parameters which is </w:t>
       </w:r>
       <w:r>
         <w:t>given in above code in Listing 3</w:t>
       </w:r>
       <w:r>
-        <w:t xml:space="preserve">. We change this </w:t>
-      </w:r>
-      <w:proofErr w:type="gramStart"/>
-      <w:r>
-        <w:t>because of</w:t>
-      </w:r>
-      <w:proofErr w:type="gramEnd"/>
-      <w:r>
-        <w:t xml:space="preserve"> we faced various issues for this when we run the program it does not works properly and shows some error also then we </w:t>
-      </w:r>
-      <w:proofErr w:type="gramStart"/>
-      <w:r>
-        <w:t>testing</w:t>
-      </w:r>
-      <w:proofErr w:type="gramEnd"/>
-      <w:r>
-        <w:t xml:space="preserve"> through various values. At </w:t>
-      </w:r>
-      <w:proofErr w:type="gramStart"/>
-      <w:r>
-        <w:t>last</w:t>
-      </w:r>
-      <w:proofErr w:type="gramEnd"/>
-      <w:r>
-        <w:t xml:space="preserve"> we found these values 121 and 1210 for </w:t>
-      </w:r>
-      <w:proofErr w:type="spellStart"/>
-      <w:r>
-        <w:t>inputBits</w:t>
-      </w:r>
-      <w:proofErr w:type="spellEnd"/>
-      <w:r>
-        <w:t xml:space="preserve"> and </w:t>
-      </w:r>
-      <w:proofErr w:type="spellStart"/>
-      <w:r>
-        <w:t>numColumns</w:t>
-      </w:r>
-      <w:proofErr w:type="spellEnd"/>
-      <w:r>
-        <w:t xml:space="preserve"> respectively which works properly for our project</w:t>
+        <w:t>. We change this because of we faced various issues for this when we run the program it does not works properly and shows some error also then we testing through various values. At last we found these values 121 and 1210 for inputBits and numColumns respectively which works properly for our project</w:t>
       </w:r>
       <w:r>
         <w:t xml:space="preserve"> [Listing 3]</w:t>
@@ -1410,21 +1252,7 @@
         <w:rPr>
           <w:lang w:val="en-US"/>
         </w:rPr>
-        <w:t xml:space="preserve">In our project, we have two types of datasets so </w:t>
-      </w:r>
-      <w:proofErr w:type="gramStart"/>
-      <w:r>
-        <w:rPr>
-          <w:lang w:val="en-US"/>
-        </w:rPr>
-        <w:t>first of all</w:t>
-      </w:r>
-      <w:proofErr w:type="gramEnd"/>
-      <w:r>
-        <w:rPr>
-          <w:lang w:val="en-US"/>
-        </w:rPr>
-        <w:t xml:space="preserve"> you have to decide which data you want to keep for </w:t>
+        <w:t xml:space="preserve">In our project, we have two types of datasets so first of all you have to decide which data you want to keep for </w:t>
       </w:r>
       <w:r>
         <w:rPr>
@@ -1456,7 +1284,6 @@
         </w:rPr>
         <w:t>“</w:t>
       </w:r>
-      <w:proofErr w:type="spellStart"/>
       <w:r>
         <w:rPr>
           <w:lang w:val="en-US"/>
@@ -1469,7 +1296,6 @@
         </w:rPr>
         <w:t>sequence</w:t>
       </w:r>
-      <w:proofErr w:type="spellEnd"/>
       <w:r>
         <w:rPr>
           <w:lang w:val="en-US"/>
@@ -1488,7 +1314,6 @@
         </w:rPr>
         <w:t>“</w:t>
       </w:r>
-      <w:proofErr w:type="spellStart"/>
       <w:r>
         <w:rPr>
           <w:lang w:val="en-US"/>
@@ -1501,7 +1326,6 @@
         </w:rPr>
         <w:t>sequence</w:t>
       </w:r>
-      <w:proofErr w:type="spellEnd"/>
       <w:r>
         <w:rPr>
           <w:lang w:val="en-US"/>
@@ -1558,49 +1382,7 @@
         <w:rPr>
           <w:lang w:val="en-US"/>
         </w:rPr>
-        <w:t xml:space="preserve">At the beginning, we use the </w:t>
-      </w:r>
-      <w:proofErr w:type="spellStart"/>
-      <w:r>
-        <w:rPr>
-          <w:lang w:val="en-US"/>
-        </w:rPr>
-        <w:t>ExtractSequencesFromFolder</w:t>
-      </w:r>
-      <w:proofErr w:type="spellEnd"/>
-      <w:r>
-        <w:rPr>
-          <w:lang w:val="en-US"/>
-        </w:rPr>
-        <w:t xml:space="preserve"> method of the </w:t>
-      </w:r>
-      <w:proofErr w:type="spellStart"/>
-      <w:r>
-        <w:rPr>
-          <w:lang w:val="en-US"/>
-        </w:rPr>
-        <w:t>CsvSequenceFolder</w:t>
-      </w:r>
-      <w:proofErr w:type="spellEnd"/>
-      <w:r>
-        <w:rPr>
-          <w:lang w:val="en-US"/>
-        </w:rPr>
-        <w:t xml:space="preserve"> class to read all files inside a folder. These classes maintain a list of numerical sequences from the read data for repeated future use. To handle non-numeric data, exception handling is incorporated within certain classes. Additionally, the </w:t>
-      </w:r>
-      <w:proofErr w:type="spellStart"/>
-      <w:r>
-        <w:rPr>
-          <w:lang w:val="en-US"/>
-        </w:rPr>
-        <w:t>TrimSequences</w:t>
-      </w:r>
-      <w:proofErr w:type="spellEnd"/>
-      <w:r>
-        <w:rPr>
-          <w:lang w:val="en-US"/>
-        </w:rPr>
-        <w:t xml:space="preserve"> technique allows data trimming by removing one to four components (numbers 1 through 4) from the start, returning a numeric sequence </w:t>
+        <w:t xml:space="preserve">At the beginning, we use the ExtractSequencesFromFolder method of the CsvSequenceFolder class to read all files inside a folder. These classes maintain a list of numerical sequences from the read data for repeated future use. To handle non-numeric data, exception handling is incorporated within certain classes. Additionally, the TrimSequences technique allows data trimming by removing one to four components (numbers 1 through 4) from the start, returning a numeric sequence </w:t>
       </w:r>
       <w:r>
         <w:rPr>
@@ -1670,20 +1452,7 @@
                     <w:jc w:val="left"/>
                   </w:pPr>
                   <w:r>
-                    <w:t xml:space="preserve">public List&lt;List&lt;double&gt;&gt; </w:t>
-                  </w:r>
-                  <w:proofErr w:type="spellStart"/>
-                  <w:proofErr w:type="gramStart"/>
-                  <w:r>
-                    <w:t>ExtractSequencesFromFolder</w:t>
-                  </w:r>
-                  <w:proofErr w:type="spellEnd"/>
-                  <w:r>
-                    <w:t>(</w:t>
-                  </w:r>
-                  <w:proofErr w:type="gramEnd"/>
-                  <w:r>
-                    <w:t>)</w:t>
+                    <w:t>public List&lt;List&lt;double&gt;&gt; ExtractSequencesFromFolder()</w:t>
                   </w:r>
                 </w:p>
                 <w:p>
@@ -1707,18 +1476,8 @@
                     <w:jc w:val="left"/>
                   </w:pPr>
                   <w:r>
-                    <w:t xml:space="preserve">          return </w:t>
-                  </w:r>
-                  <w:proofErr w:type="spellStart"/>
-                  <w:proofErr w:type="gramStart"/>
-                  <w:r>
-                    <w:t>folderSequences</w:t>
-                  </w:r>
-                  <w:proofErr w:type="spellEnd"/>
-                  <w:r>
-                    <w:t>;</w:t>
-                  </w:r>
-                  <w:proofErr w:type="gramEnd"/>
+                    <w:t xml:space="preserve">          return folderSequences;</w:t>
+                  </w:r>
                 </w:p>
                 <w:p>
                   <w:pPr>
@@ -1738,20 +1497,7 @@
                     <w:jc w:val="left"/>
                   </w:pPr>
                   <w:r>
-                    <w:t xml:space="preserve">public static List&lt;List&lt;double&gt;&gt; </w:t>
-                  </w:r>
-                  <w:proofErr w:type="spellStart"/>
-                  <w:proofErr w:type="gramStart"/>
-                  <w:r>
-                    <w:t>TrimSequences</w:t>
-                  </w:r>
-                  <w:proofErr w:type="spellEnd"/>
-                  <w:r>
-                    <w:t>(</w:t>
-                  </w:r>
-                  <w:proofErr w:type="gramEnd"/>
-                  <w:r>
-                    <w:t>List&lt;List&lt;double&gt;&gt; sequences)</w:t>
+                    <w:t>public static List&lt;List&lt;double&gt;&gt; TrimSequences(List&lt;List&lt;double&gt;&gt; sequences)</w:t>
                   </w:r>
                 </w:p>
                 <w:p>
@@ -1775,18 +1521,8 @@
                     <w:jc w:val="left"/>
                   </w:pPr>
                   <w:r>
-                    <w:t xml:space="preserve">          return </w:t>
-                  </w:r>
-                  <w:proofErr w:type="spellStart"/>
-                  <w:proofErr w:type="gramStart"/>
-                  <w:r>
-                    <w:t>trimmedSequences</w:t>
-                  </w:r>
-                  <w:proofErr w:type="spellEnd"/>
-                  <w:r>
-                    <w:t>;</w:t>
-                  </w:r>
-                  <w:proofErr w:type="gramEnd"/>
+                    <w:t xml:space="preserve">          return trimmedSequences;</w:t>
+                  </w:r>
                 </w:p>
                 <w:p>
                   <w:pPr>
@@ -1829,35 +1565,7 @@
         <w:rPr>
           <w:lang w:val="en-GB"/>
         </w:rPr>
-        <w:t xml:space="preserve">Subsequently, the </w:t>
-      </w:r>
-      <w:proofErr w:type="spellStart"/>
-      <w:r>
-        <w:rPr>
-          <w:lang w:val="en-GB"/>
-        </w:rPr>
-        <w:t>ConvertToHTMInput</w:t>
-      </w:r>
-      <w:proofErr w:type="spellEnd"/>
-      <w:r>
-        <w:rPr>
-          <w:lang w:val="en-GB"/>
-        </w:rPr>
-        <w:t xml:space="preserve"> method of the </w:t>
-      </w:r>
-      <w:proofErr w:type="spellStart"/>
-      <w:r>
-        <w:rPr>
-          <w:lang w:val="en-GB"/>
-        </w:rPr>
-        <w:t>CSVToHTMInputConverter</w:t>
-      </w:r>
-      <w:proofErr w:type="spellEnd"/>
-      <w:r>
-        <w:rPr>
-          <w:lang w:val="en-GB"/>
-        </w:rPr>
-        <w:t xml:space="preserve"> class is employed to transform all the extracted sequences into a format compatible with Hierarchical Temporal Memory (HTM) training</w:t>
+        <w:t>Subsequently, the ConvertToHTMInput method of the CSVToHTMInputConverter class is employed to transform all the extracted sequences into a format compatible with Hierarchical Temporal Memory (HTM) training</w:t>
       </w:r>
       <w:r>
         <w:rPr>
@@ -1932,93 +1640,21 @@
                     <w:rPr>
                       <w:lang w:val="en-GB"/>
                     </w:rPr>
-                    <w:t>Dictionary&lt;string, List&lt;double&gt;&gt; dictionary = new Dictionary&lt;string, List&lt;double&gt;</w:t>
-                  </w:r>
-                  <w:proofErr w:type="gramStart"/>
-                  <w:r>
+                    <w:t>Dictionary&lt;string, List&lt;double&gt;&gt; dictionary = new Dictionary&lt;string, List&lt;double&gt;&gt;();</w:t>
+                  </w:r>
+                </w:p>
+                <w:p>
+                  <w:pPr>
+                    <w:jc w:val="left"/>
                     <w:rPr>
                       <w:lang w:val="en-GB"/>
                     </w:rPr>
-                    <w:t>&gt;(</w:t>
-                  </w:r>
-                  <w:proofErr w:type="gramEnd"/>
+                  </w:pPr>
                   <w:r>
                     <w:rPr>
                       <w:lang w:val="en-GB"/>
                     </w:rPr>
-                    <w:t>);</w:t>
-                  </w:r>
-                </w:p>
-                <w:p>
-                  <w:pPr>
-                    <w:jc w:val="left"/>
-                    <w:rPr>
-                      <w:lang w:val="en-GB"/>
-                    </w:rPr>
-                  </w:pPr>
-                  <w:r>
-                    <w:rPr>
-                      <w:lang w:val="en-GB"/>
-                    </w:rPr>
-                    <w:t xml:space="preserve">for (int </w:t>
-                  </w:r>
-                  <w:proofErr w:type="spellStart"/>
-                  <w:r>
-                    <w:rPr>
-                      <w:lang w:val="en-GB"/>
-                    </w:rPr>
-                    <w:t>i</w:t>
-                  </w:r>
-                  <w:proofErr w:type="spellEnd"/>
-                  <w:r>
-                    <w:rPr>
-                      <w:lang w:val="en-GB"/>
-                    </w:rPr>
-                    <w:t xml:space="preserve"> = 0; </w:t>
-                  </w:r>
-                  <w:proofErr w:type="spellStart"/>
-                  <w:r>
-                    <w:rPr>
-                      <w:lang w:val="en-GB"/>
-                    </w:rPr>
-                    <w:t>i</w:t>
-                  </w:r>
-                  <w:proofErr w:type="spellEnd"/>
-                  <w:r>
-                    <w:rPr>
-                      <w:lang w:val="en-GB"/>
-                    </w:rPr>
-                    <w:t xml:space="preserve"> &lt; </w:t>
-                  </w:r>
-                  <w:proofErr w:type="spellStart"/>
-                  <w:proofErr w:type="gramStart"/>
-                  <w:r>
-                    <w:rPr>
-                      <w:lang w:val="en-GB"/>
-                    </w:rPr>
-                    <w:t>sequences.Count</w:t>
-                  </w:r>
-                  <w:proofErr w:type="spellEnd"/>
-                  <w:proofErr w:type="gramEnd"/>
-                  <w:r>
-                    <w:rPr>
-                      <w:lang w:val="en-GB"/>
-                    </w:rPr>
-                    <w:t xml:space="preserve">; </w:t>
-                  </w:r>
-                  <w:proofErr w:type="spellStart"/>
-                  <w:r>
-                    <w:rPr>
-                      <w:lang w:val="en-GB"/>
-                    </w:rPr>
-                    <w:t>i</w:t>
-                  </w:r>
-                  <w:proofErr w:type="spellEnd"/>
-                  <w:r>
-                    <w:rPr>
-                      <w:lang w:val="en-GB"/>
-                    </w:rPr>
-                    <w:t>++)</w:t>
+                    <w:t>for (int i = 0; i &lt; sequences.Count; i++)</w:t>
                   </w:r>
                 </w:p>
                 <w:p>
@@ -2060,89 +1696,35 @@
                     <w:rPr>
                       <w:lang w:val="en-GB"/>
                     </w:rPr>
-                    <w:t xml:space="preserve">     string key = "S" + (</w:t>
-                  </w:r>
-                  <w:proofErr w:type="spellStart"/>
-                  <w:r>
+                    <w:t xml:space="preserve">     string key = "S" + (i + 1);</w:t>
+                  </w:r>
+                </w:p>
+                <w:p>
+                  <w:pPr>
+                    <w:jc w:val="left"/>
                     <w:rPr>
                       <w:lang w:val="en-GB"/>
                     </w:rPr>
-                    <w:t>i</w:t>
-                  </w:r>
-                  <w:proofErr w:type="spellEnd"/>
+                  </w:pPr>
                   <w:r>
                     <w:rPr>
                       <w:lang w:val="en-GB"/>
                     </w:rPr>
-                    <w:t xml:space="preserve"> + 1</w:t>
-                  </w:r>
-                  <w:proofErr w:type="gramStart"/>
-                  <w:r>
+                    <w:t xml:space="preserve">     List&lt;double&gt; value = sequences[i];</w:t>
+                  </w:r>
+                </w:p>
+                <w:p>
+                  <w:pPr>
+                    <w:jc w:val="left"/>
                     <w:rPr>
                       <w:lang w:val="en-GB"/>
                     </w:rPr>
-                    <w:t>);</w:t>
-                  </w:r>
-                  <w:proofErr w:type="gramEnd"/>
-                </w:p>
-                <w:p>
-                  <w:pPr>
-                    <w:jc w:val="left"/>
+                  </w:pPr>
+                  <w:r>
                     <w:rPr>
                       <w:lang w:val="en-GB"/>
                     </w:rPr>
-                  </w:pPr>
-                  <w:r>
-                    <w:rPr>
-                      <w:lang w:val="en-GB"/>
-                    </w:rPr>
-                    <w:t xml:space="preserve">     List&lt;double&gt; value = sequences[</w:t>
-                  </w:r>
-                  <w:proofErr w:type="spellStart"/>
-                  <w:r>
-                    <w:rPr>
-                      <w:lang w:val="en-GB"/>
-                    </w:rPr>
-                    <w:t>i</w:t>
-                  </w:r>
-                  <w:proofErr w:type="spellEnd"/>
-                  <w:proofErr w:type="gramStart"/>
-                  <w:r>
-                    <w:rPr>
-                      <w:lang w:val="en-GB"/>
-                    </w:rPr>
-                    <w:t>];</w:t>
-                  </w:r>
-                  <w:proofErr w:type="gramEnd"/>
-                </w:p>
-                <w:p>
-                  <w:pPr>
-                    <w:jc w:val="left"/>
-                    <w:rPr>
-                      <w:lang w:val="en-GB"/>
-                    </w:rPr>
-                  </w:pPr>
-                  <w:r>
-                    <w:rPr>
-                      <w:lang w:val="en-GB"/>
-                    </w:rPr>
-                    <w:t xml:space="preserve">     </w:t>
-                  </w:r>
-                  <w:proofErr w:type="spellStart"/>
-                  <w:proofErr w:type="gramStart"/>
-                  <w:r>
-                    <w:rPr>
-                      <w:lang w:val="en-GB"/>
-                    </w:rPr>
-                    <w:t>dictionary.Add</w:t>
-                  </w:r>
-                  <w:proofErr w:type="spellEnd"/>
-                  <w:proofErr w:type="gramEnd"/>
-                  <w:r>
-                    <w:rPr>
-                      <w:lang w:val="en-GB"/>
-                    </w:rPr>
-                    <w:t>(key, value);</w:t>
+                    <w:t xml:space="preserve">     dictionary.Add(key, value);</w:t>
                   </w:r>
                 </w:p>
                 <w:p>
@@ -2170,16 +1752,8 @@
                     <w:rPr>
                       <w:lang w:val="en-GB"/>
                     </w:rPr>
-                    <w:t xml:space="preserve">     return </w:t>
-                  </w:r>
-                  <w:proofErr w:type="gramStart"/>
-                  <w:r>
-                    <w:rPr>
-                      <w:lang w:val="en-GB"/>
-                    </w:rPr>
-                    <w:t>dictionary;</w:t>
-                  </w:r>
-                  <w:proofErr w:type="gramEnd"/>
+                    <w:t xml:space="preserve">     return dictionary;</w:t>
+                  </w:r>
                 </w:p>
                 <w:p>
                   <w:pPr>
@@ -2207,23 +1781,7 @@
         <w:jc w:val="both"/>
       </w:pPr>
       <w:r>
-        <w:t xml:space="preserve">After that, the </w:t>
-      </w:r>
-      <w:proofErr w:type="spellStart"/>
-      <w:r>
-        <w:t>ExecuteHTMModelTraining</w:t>
-      </w:r>
-      <w:proofErr w:type="spellEnd"/>
-      <w:r>
-        <w:t xml:space="preserve"> method of the </w:t>
-      </w:r>
-      <w:proofErr w:type="spellStart"/>
-      <w:r>
-        <w:t>HTMTrainingManager</w:t>
-      </w:r>
-      <w:proofErr w:type="spellEnd"/>
-      <w:r>
-        <w:t xml:space="preserve"> class is used to train the model using the converted sequences. The numerical data sequences from both the training (for learning) and predicting folders are combined before training the HTM engine. This class then returns the trained model object, which serves as the </w:t>
+        <w:t xml:space="preserve">After that, the ExecuteHTMModelTraining method of the HTMTrainingManager class is used to train the model using the converted sequences. The numerical data sequences from both the training (for learning) and predicting folders are combined before training the HTM engine. This class then returns the trained model object, which serves as the </w:t>
       </w:r>
       <w:r>
         <w:t>predictor</w:t>
@@ -2294,26 +1852,8 @@
                   <w:pPr>
                     <w:jc w:val="both"/>
                   </w:pPr>
-                  <w:proofErr w:type="spellStart"/>
-                  <w:r>
-                    <w:t>MultiSequenceLearning</w:t>
-                  </w:r>
-                  <w:proofErr w:type="spellEnd"/>
-                  <w:r>
-                    <w:t xml:space="preserve"> learning = new </w:t>
-                  </w:r>
-                  <w:proofErr w:type="spellStart"/>
-                  <w:proofErr w:type="gramStart"/>
-                  <w:r>
-                    <w:t>MultiSequenceLearning</w:t>
-                  </w:r>
-                  <w:proofErr w:type="spellEnd"/>
-                  <w:r>
-                    <w:t>(</w:t>
-                  </w:r>
-                  <w:proofErr w:type="gramEnd"/>
-                  <w:r>
-                    <w:t>);</w:t>
+                  <w:r>
+                    <w:t>MultiSequenceLearning learning = new MultiSequenceLearning();</w:t>
                   </w:r>
                 </w:p>
                 <w:p>
@@ -2321,25 +1861,7 @@
                     <w:jc w:val="both"/>
                   </w:pPr>
                   <w:r>
-                    <w:t xml:space="preserve">predictor = </w:t>
-                  </w:r>
-                  <w:proofErr w:type="spellStart"/>
-                  <w:proofErr w:type="gramStart"/>
-                  <w:r>
-                    <w:t>learning.Run</w:t>
-                  </w:r>
-                  <w:proofErr w:type="spellEnd"/>
-                  <w:proofErr w:type="gramEnd"/>
-                  <w:r>
-                    <w:t>(</w:t>
-                  </w:r>
-                  <w:proofErr w:type="spellStart"/>
-                  <w:r>
-                    <w:t>htmInput</w:t>
-                  </w:r>
-                  <w:proofErr w:type="spellEnd"/>
-                  <w:r>
-                    <w:t>);</w:t>
+                    <w:t>predictor = learning.Run(htmInput);</w:t>
                   </w:r>
                 </w:p>
                 <w:p>
@@ -2363,39 +1885,16 @@
                     <w:jc w:val="both"/>
                   </w:pPr>
                   <w:r>
-                    <w:t xml:space="preserve">List&lt;List&lt;double&gt;&gt; </w:t>
-                  </w:r>
-                  <w:proofErr w:type="spellStart"/>
-                  <w:r>
-                    <w:t>combinedSequences</w:t>
-                  </w:r>
-                  <w:proofErr w:type="spellEnd"/>
-                  <w:r>
-                    <w:t xml:space="preserve"> = new List&lt;List&lt;double&gt;&gt;(sequences1</w:t>
-                  </w:r>
-                  <w:proofErr w:type="gramStart"/>
-                  <w:r>
-                    <w:t>);</w:t>
-                  </w:r>
-                  <w:proofErr w:type="gramEnd"/>
+                    <w:t>List&lt;List&lt;double&gt;&gt; combinedSequences = new List&lt;List&lt;double&gt;&gt;(sequences1);</w:t>
+                  </w:r>
                 </w:p>
                 <w:p>
                   <w:pPr>
                     <w:jc w:val="both"/>
                   </w:pPr>
-                  <w:proofErr w:type="spellStart"/>
-                  <w:r>
-                    <w:t>combinedSequences.AddRange</w:t>
-                  </w:r>
-                  <w:proofErr w:type="spellEnd"/>
-                  <w:r>
-                    <w:t>(sequences2</w:t>
-                  </w:r>
-                  <w:proofErr w:type="gramStart"/>
-                  <w:r>
-                    <w:t>);</w:t>
-                  </w:r>
-                  <w:proofErr w:type="gramEnd"/>
+                  <w:r>
+                    <w:t>combinedSequences.AddRange(sequences2);</w:t>
+                  </w:r>
                 </w:p>
                 <w:p>
                   <w:pPr>
@@ -2423,112 +1922,35 @@
         <w:spacing w:line="256" w:lineRule="auto"/>
         <w:jc w:val="both"/>
       </w:pPr>
-      <w:proofErr w:type="spellStart"/>
       <w:r>
         <w:t>A</w:t>
       </w:r>
       <w:r>
-        <w:t>In</w:t>
-      </w:r>
-      <w:proofErr w:type="spellEnd"/>
-      <w:r>
-        <w:t xml:space="preserve"> the end, we use the </w:t>
-      </w:r>
-      <w:proofErr w:type="spellStart"/>
-      <w:r>
-        <w:fldChar w:fldCharType="begin"/>
-      </w:r>
-      <w:r>
-        <w:instrText>HYPERLINK "https://github.com/almahamud1234/neocortexapi/blob/MatrixMasters/source/MySEProject/AnomalyDetectionSample/HTMAnomalyExperiment.cs"</w:instrText>
-      </w:r>
-      <w:r>
-        <w:fldChar w:fldCharType="separate"/>
-      </w:r>
-      <w:r>
-        <w:rPr>
-          <w:rStyle w:val="Hyperlink"/>
-        </w:rPr>
-        <w:t>HTMAnomalyExperiment</w:t>
-      </w:r>
-      <w:proofErr w:type="spellEnd"/>
-      <w:r>
-        <w:fldChar w:fldCharType="end"/>
-      </w:r>
-      <w:r>
-        <w:t> class to detect anomalies in sequences read from files inside the predicting folder. All the previously explained classes—CSV file reading (using </w:t>
-      </w:r>
-      <w:proofErr w:type="spellStart"/>
-      <w:r>
-        <w:t>CsvSequenceFolder</w:t>
-      </w:r>
-      <w:proofErr w:type="spellEnd"/>
-      <w:r>
-        <w:t>), combining and converting them for HTM training (using </w:t>
-      </w:r>
-      <w:proofErr w:type="spellStart"/>
-      <w:r>
-        <w:t>CSVToHTMInputConverter</w:t>
-      </w:r>
-      <w:proofErr w:type="spellEnd"/>
-      <w:r>
-        <w:t>), and training the HTM engine (via </w:t>
-      </w:r>
-      <w:proofErr w:type="spellStart"/>
-      <w:r>
-        <w:t>HTMTrainingManager</w:t>
-      </w:r>
-      <w:proofErr w:type="spellEnd"/>
-      <w:r>
-        <w:t>)—are utilized here. The same </w:t>
-      </w:r>
-      <w:proofErr w:type="spellStart"/>
-      <w:r>
-        <w:t>CsvSequenceFolder</w:t>
-      </w:r>
-      <w:proofErr w:type="spellEnd"/>
-      <w:r>
-        <w:t> class is used to read files for predicting sequences. The </w:t>
-      </w:r>
-      <w:proofErr w:type="spellStart"/>
-      <w:r>
-        <w:t>TrimSequences</w:t>
-      </w:r>
-      <w:proofErr w:type="spellEnd"/>
-      <w:r>
-        <w:t xml:space="preserve"> method is then applied to trim sequences for anomaly testing, as explained </w:t>
-      </w:r>
-      <w:proofErr w:type="spellStart"/>
-      <w:proofErr w:type="gramStart"/>
-      <w:r>
-        <w:t>earlier.</w:t>
-      </w:r>
-      <w:r>
-        <w:t>fter</w:t>
-      </w:r>
-      <w:proofErr w:type="spellEnd"/>
-      <w:proofErr w:type="gramEnd"/>
-      <w:r>
-        <w:t xml:space="preserve"> that we use </w:t>
-      </w:r>
-      <w:proofErr w:type="spellStart"/>
-      <w:r>
-        <w:t>multisequencelearning</w:t>
-      </w:r>
-      <w:proofErr w:type="spellEnd"/>
-      <w:r>
-        <w:t xml:space="preserve"> classes for training our HTM model</w:t>
+        <w:t>In the end, we use the </w:t>
+      </w:r>
+      <w:hyperlink r:id="rId11" w:history="1">
+        <w:r>
+          <w:rPr>
+            <w:rStyle w:val="Hyperlink"/>
+          </w:rPr>
+          <w:t>HTMAnomalyExperiment</w:t>
+        </w:r>
+      </w:hyperlink>
+      <w:r>
+        <w:t> class to detect anomalies in sequences read from files inside the predicting folder. All the previously explained classes—CSV file reading (using CsvSequenceFolder), combining and converting them for HTM training (using CSVToHTMInputConverter), and training the HTM engine (via HTMTrainingManager)—are utilized here. The same CsvSequenceFolder class is used to read files for predicting sequences. The TrimSequences method is then applied to trim sequences for anomaly testing, as explained earlier.</w:t>
+      </w:r>
+      <w:r>
+        <w:t xml:space="preserve">fter that we use </w:t>
+      </w:r>
+      <w:r>
+        <w:t>multisequencelearning classes for training our HTM model</w:t>
       </w:r>
       <w:r>
         <w:t xml:space="preserve"> which is given below. Where w</w:t>
       </w:r>
       <w:r>
-        <w:t xml:space="preserve">e used the predictor object as a trained HTM model to predict anomalies from our extracted data from </w:t>
-      </w:r>
-      <w:proofErr w:type="spellStart"/>
-      <w:r>
-        <w:t>predicting_files</w:t>
-      </w:r>
-      <w:proofErr w:type="spellEnd"/>
+        <w:t>e used the predictor object as a trained HTM model to predict anomalies from our extracted data from predicting_files</w:t>
+      </w:r>
       <w:r>
         <w:t xml:space="preserve"> [Listing 7]</w:t>
       </w:r>
@@ -2580,89 +2002,33 @@
                   <w:pPr>
                     <w:jc w:val="left"/>
                   </w:pPr>
-                  <w:proofErr w:type="spellStart"/>
-                  <w:r>
-                    <w:t>allTestingData.Add</w:t>
-                  </w:r>
-                  <w:proofErr w:type="spellEnd"/>
-                  <w:r>
-                    <w:t>(</w:t>
-                  </w:r>
-                  <w:proofErr w:type="spellStart"/>
-                  <w:proofErr w:type="gramStart"/>
-                  <w:r>
-                    <w:t>sequence.ToArray</w:t>
-                  </w:r>
-                  <w:proofErr w:type="spellEnd"/>
-                  <w:proofErr w:type="gramEnd"/>
-                  <w:r>
-                    <w:t>());</w:t>
-                  </w:r>
-                </w:p>
-                <w:p>
-                  <w:pPr>
-                    <w:jc w:val="left"/>
-                  </w:pPr>
-                  <w:r>
-                    <w:t xml:space="preserve">var (log, anomalies) = </w:t>
-                  </w:r>
-                  <w:proofErr w:type="spellStart"/>
-                  <w:proofErr w:type="gramStart"/>
-                  <w:r>
-                    <w:t>DetectAnomalyOnSequence</w:t>
-                  </w:r>
-                  <w:proofErr w:type="spellEnd"/>
-                  <w:r>
-                    <w:t>(</w:t>
-                  </w:r>
-                  <w:proofErr w:type="gramEnd"/>
-                  <w:r>
-                    <w:t xml:space="preserve">predictor, </w:t>
-                  </w:r>
-                  <w:proofErr w:type="spellStart"/>
-                  <w:r>
-                    <w:t>sequence.ToArray</w:t>
-                  </w:r>
-                  <w:proofErr w:type="spellEnd"/>
-                  <w:r>
-                    <w:t>(), _tolerance);</w:t>
-                  </w:r>
-                </w:p>
-                <w:p>
-                  <w:pPr>
-                    <w:jc w:val="left"/>
-                  </w:pPr>
-                  <w:proofErr w:type="spellStart"/>
-                  <w:r>
-                    <w:t>experimentResults.AddRange</w:t>
-                  </w:r>
-                  <w:proofErr w:type="spellEnd"/>
-                  <w:r>
-                    <w:t>(log</w:t>
-                  </w:r>
-                  <w:proofErr w:type="gramStart"/>
-                  <w:r>
-                    <w:t>);</w:t>
-                  </w:r>
-                  <w:proofErr w:type="gramEnd"/>
-                </w:p>
-                <w:p>
-                  <w:pPr>
-                    <w:jc w:val="left"/>
-                  </w:pPr>
-                  <w:proofErr w:type="spellStart"/>
-                  <w:r>
-                    <w:t>allAnomalyIndices.Add</w:t>
-                  </w:r>
-                  <w:proofErr w:type="spellEnd"/>
-                  <w:r>
-                    <w:t>(anomalies</w:t>
-                  </w:r>
-                  <w:proofErr w:type="gramStart"/>
-                  <w:r>
-                    <w:t>);</w:t>
-                  </w:r>
-                  <w:proofErr w:type="gramEnd"/>
+                  <w:r>
+                    <w:t>allTestingData.Add(sequence.ToArray());</w:t>
+                  </w:r>
+                </w:p>
+                <w:p>
+                  <w:pPr>
+                    <w:jc w:val="left"/>
+                  </w:pPr>
+                  <w:r>
+                    <w:t>var (log, anomalies) = DetectAnomalyOnSequence(predictor, sequence.ToArray(), _tolerance);</w:t>
+                  </w:r>
+                </w:p>
+                <w:p>
+                  <w:pPr>
+                    <w:jc w:val="left"/>
+                  </w:pPr>
+                  <w:r>
+                    <w:t>experimentResults.AddRange(log);</w:t>
+                  </w:r>
+                </w:p>
+                <w:p>
+                  <w:pPr>
+                    <w:jc w:val="left"/>
+                  </w:pPr>
+                  <w:r>
+                    <w:t>allAnomalyIndices.Add(anomalies);</w:t>
+                  </w:r>
                 </w:p>
                 <w:p>
                   <w:pPr>
@@ -2710,13 +2076,8 @@
       <w:pPr>
         <w:pStyle w:val="Code"/>
       </w:pPr>
-      <w:proofErr w:type="gramStart"/>
-      <w:r>
-        <w:t>Listing</w:t>
-      </w:r>
-      <w:proofErr w:type="gramEnd"/>
-      <w:r>
-        <w:t xml:space="preserve"> 8 </w:t>
+      <w:r>
+        <w:t xml:space="preserve">Listing 8 </w:t>
       </w:r>
       <w:r>
         <w:t>Configuring CSV Folder Paths</w:t>
@@ -2745,84 +2106,16 @@
                     <w:jc w:val="left"/>
                   </w:pPr>
                   <w:r>
-                    <w:t>_</w:t>
-                  </w:r>
-                  <w:proofErr w:type="spellStart"/>
-                  <w:r>
-                    <w:t>trainingCSVFolderPath</w:t>
-                  </w:r>
-                  <w:proofErr w:type="spellEnd"/>
-                  <w:r>
-                    <w:t xml:space="preserve"> = </w:t>
-                  </w:r>
-                  <w:proofErr w:type="spellStart"/>
-                  <w:r>
-                    <w:t>Path.Combine</w:t>
-                  </w:r>
-                  <w:proofErr w:type="spellEnd"/>
-                  <w:r>
-                    <w:t>(</w:t>
-                  </w:r>
-                  <w:proofErr w:type="spellStart"/>
-                  <w:r>
-                    <w:t>projectBaseDirectory</w:t>
-                  </w:r>
-                  <w:proofErr w:type="spellEnd"/>
-                  <w:r>
-                    <w:t xml:space="preserve">, </w:t>
-                  </w:r>
-                  <w:proofErr w:type="spellStart"/>
-                  <w:r>
-                    <w:t>trainingFolderPath</w:t>
-                  </w:r>
-                  <w:proofErr w:type="spellEnd"/>
-                  <w:proofErr w:type="gramStart"/>
-                  <w:r>
-                    <w:t>);</w:t>
-                  </w:r>
-                  <w:proofErr w:type="gramEnd"/>
-                </w:p>
-                <w:p>
-                  <w:pPr>
-                    <w:jc w:val="left"/>
-                  </w:pPr>
-                  <w:r>
-                    <w:t>_</w:t>
-                  </w:r>
-                  <w:proofErr w:type="spellStart"/>
-                  <w:r>
-                    <w:t>predictingCSVFolderPath</w:t>
-                  </w:r>
-                  <w:proofErr w:type="spellEnd"/>
-                  <w:r>
-                    <w:t xml:space="preserve"> = </w:t>
-                  </w:r>
-                  <w:proofErr w:type="spellStart"/>
-                  <w:r>
-                    <w:t>Path.Combine</w:t>
-                  </w:r>
-                  <w:proofErr w:type="spellEnd"/>
-                  <w:r>
-                    <w:t>(</w:t>
-                  </w:r>
-                  <w:proofErr w:type="spellStart"/>
-                  <w:r>
-                    <w:t>projectBaseDirectory</w:t>
-                  </w:r>
-                  <w:proofErr w:type="spellEnd"/>
-                  <w:r>
-                    <w:t xml:space="preserve">, </w:t>
-                  </w:r>
-                  <w:proofErr w:type="spellStart"/>
-                  <w:r>
-                    <w:t>predictingFolderPath</w:t>
-                  </w:r>
-                  <w:proofErr w:type="spellEnd"/>
-                  <w:proofErr w:type="gramStart"/>
-                  <w:r>
-                    <w:t>);</w:t>
-                  </w:r>
-                  <w:proofErr w:type="gramEnd"/>
+                    <w:t>_trainingCSVFolderPath = Path.Combine(projectBaseDirectory, trainingFolderPath);</w:t>
+                  </w:r>
+                </w:p>
+                <w:p>
+                  <w:pPr>
+                    <w:jc w:val="left"/>
+                  </w:pPr>
+                  <w:r>
+                    <w:t>_predictingCSVFolderPath = Path.Combine(projectBaseDirectory, predictingFolderPath);</w:t>
+                  </w:r>
                 </w:p>
                 <w:p>
                   <w:pPr>
@@ -2842,15 +2135,7 @@
         <w:br/>
       </w:r>
       <w:r>
-        <w:t>In the end, the </w:t>
-      </w:r>
-      <w:proofErr w:type="spellStart"/>
-      <w:r>
-        <w:t>DetectAnomaly</w:t>
-      </w:r>
-      <w:proofErr w:type="spellEnd"/>
-      <w:r>
-        <w:t> method is used to detect anomalies in our trimmed sequences one by one, utilizing the trained HTM model predictor</w:t>
+        <w:t>In the end, the DetectAnomaly method is used to detect anomalies in our trimmed sequences one by one, utilizing the trained HTM model predictor</w:t>
       </w:r>
       <w:r>
         <w:t xml:space="preserve"> </w:t>
@@ -2878,14 +2163,9 @@
       <w:pPr>
         <w:pStyle w:val="Code"/>
       </w:pPr>
-      <w:proofErr w:type="gramStart"/>
       <w:r>
         <w:lastRenderedPageBreak/>
-        <w:t>Listing</w:t>
-      </w:r>
-      <w:proofErr w:type="gramEnd"/>
-      <w:r>
-        <w:t xml:space="preserve"> 9 </w:t>
+        <w:t xml:space="preserve">Listing 9 </w:t>
       </w:r>
       <w:r>
         <w:t>Applying Anomaly Detection to Test Data</w:t>
@@ -2911,15 +2191,7 @@
                     <w:jc w:val="left"/>
                   </w:pPr>
                   <w:r>
-                    <w:t xml:space="preserve">foreach (List&lt;double&gt; list in </w:t>
-                  </w:r>
-                  <w:proofErr w:type="spellStart"/>
-                  <w:r>
-                    <w:t>triminputtestseq</w:t>
-                  </w:r>
-                  <w:proofErr w:type="spellEnd"/>
-                  <w:r>
-                    <w:t>)</w:t>
+                    <w:t>foreach (List&lt;double&gt; list in triminputtestseq)</w:t>
                   </w:r>
                 </w:p>
                 <w:p>
@@ -2943,65 +2215,15 @@
                     <w:jc w:val="left"/>
                   </w:pPr>
                   <w:r>
-                    <w:t xml:space="preserve">         </w:t>
-                  </w:r>
-                  <w:proofErr w:type="gramStart"/>
-                  <w:r>
-                    <w:t>double[</w:t>
-                  </w:r>
-                  <w:proofErr w:type="gramEnd"/>
-                  <w:r>
-                    <w:t xml:space="preserve">] </w:t>
-                  </w:r>
-                  <w:proofErr w:type="spellStart"/>
-                  <w:r>
-                    <w:t>lst</w:t>
-                  </w:r>
-                  <w:proofErr w:type="spellEnd"/>
-                  <w:r>
-                    <w:t xml:space="preserve"> = </w:t>
-                  </w:r>
-                  <w:proofErr w:type="spellStart"/>
-                  <w:r>
-                    <w:t>list.ToArray</w:t>
-                  </w:r>
-                  <w:proofErr w:type="spellEnd"/>
-                  <w:r>
-                    <w:t>();</w:t>
-                  </w:r>
-                </w:p>
-                <w:p>
-                  <w:pPr>
-                    <w:jc w:val="left"/>
-                  </w:pPr>
-                  <w:r>
-                    <w:t xml:space="preserve">         </w:t>
-                  </w:r>
-                  <w:proofErr w:type="spellStart"/>
-                  <w:proofErr w:type="gramStart"/>
-                  <w:r>
-                    <w:t>DetectAnomaly</w:t>
-                  </w:r>
-                  <w:proofErr w:type="spellEnd"/>
-                  <w:r>
-                    <w:t>(</w:t>
-                  </w:r>
-                  <w:proofErr w:type="spellStart"/>
-                  <w:proofErr w:type="gramEnd"/>
-                  <w:r>
-                    <w:t>myPredictor</w:t>
-                  </w:r>
-                  <w:proofErr w:type="spellEnd"/>
-                  <w:r>
-                    <w:t xml:space="preserve">, </w:t>
-                  </w:r>
-                  <w:proofErr w:type="spellStart"/>
-                  <w:r>
-                    <w:t>lst</w:t>
-                  </w:r>
-                  <w:proofErr w:type="spellEnd"/>
-                  <w:r>
-                    <w:t>);</w:t>
+                    <w:t xml:space="preserve">         double[] lst = list.ToArray();</w:t>
+                  </w:r>
+                </w:p>
+                <w:p>
+                  <w:pPr>
+                    <w:jc w:val="left"/>
+                  </w:pPr>
+                  <w:r>
+                    <w:t xml:space="preserve">         DetectAnomaly(myPredictor, lst);</w:t>
                   </w:r>
                 </w:p>
                 <w:p>
@@ -3037,21 +2259,7 @@
         <w:rPr>
           <w:lang w:val="en-GB"/>
         </w:rPr>
-        <w:t>Exception handling is implemented to manage errors thrown by the </w:t>
-      </w:r>
-      <w:proofErr w:type="spellStart"/>
-      <w:r>
-        <w:rPr>
-          <w:lang w:val="en-GB"/>
-        </w:rPr>
-        <w:t>DetectAnomaly</w:t>
-      </w:r>
-      <w:proofErr w:type="spellEnd"/>
-      <w:r>
-        <w:rPr>
-          <w:lang w:val="en-GB"/>
-        </w:rPr>
-        <w:t> method, such as passing non-numeric values or when the number of elements in the list is less than two.</w:t>
+        <w:t>Exception handling is implemented to manage errors thrown by the DetectAnomaly method, such as passing non-numeric values or when the number of elements in the list is less than two.</w:t>
       </w:r>
     </w:p>
     <w:p>
@@ -3068,46 +2276,20 @@
         </w:rPr>
         <w:t>The </w:t>
       </w:r>
-      <w:proofErr w:type="spellStart"/>
-      <w:r>
-        <w:fldChar w:fldCharType="begin"/>
-      </w:r>
-      <w:r>
-        <w:instrText>HYPERLINK "https://github.com/almahamud1234/neocortexapi/blob/a05b009aaa68c6f3c7961583e2c247ee943d98a9/source/MySEProject/AnomalyDetectionSample/HTMAnomalyExperiment.cs" \l "L68"</w:instrText>
-      </w:r>
-      <w:r>
-        <w:fldChar w:fldCharType="separate"/>
-      </w:r>
-      <w:r>
-        <w:rPr>
-          <w:rStyle w:val="Hyperlink"/>
+      <w:hyperlink r:id="rId12" w:anchor="L68" w:history="1">
+        <w:r>
+          <w:rPr>
+            <w:rStyle w:val="Hyperlink"/>
+            <w:lang w:val="en-GB"/>
+          </w:rPr>
+          <w:t>DetectAnomaly</w:t>
+        </w:r>
+      </w:hyperlink>
+      <w:r>
+        <w:rPr>
           <w:lang w:val="en-GB"/>
         </w:rPr>
-        <w:t>DetectAnomaly</w:t>
-      </w:r>
-      <w:proofErr w:type="spellEnd"/>
-      <w:r>
-        <w:fldChar w:fldCharType="end"/>
-      </w:r>
-      <w:r>
-        <w:rPr>
-          <w:lang w:val="en-GB"/>
-        </w:rPr>
-        <w:t> method, which is the main method of the </w:t>
-      </w:r>
-      <w:proofErr w:type="spellStart"/>
-      <w:r>
-        <w:rPr>
-          <w:lang w:val="en-GB"/>
-        </w:rPr>
-        <w:t>ExtractSequencesFromFolder</w:t>
-      </w:r>
-      <w:proofErr w:type="spellEnd"/>
-      <w:r>
-        <w:rPr>
-          <w:lang w:val="en-GB"/>
-        </w:rPr>
-        <w:t> class, detects anomalies in our data. It traverses each value in the list one by one in a sliding window manner, using the trained model predictor to predict the next element for comparison. An anomaly score is used to quantify the comparison, and if the prediction exceeds a certain tolerance level, it is flagged as an anomaly.</w:t>
+        <w:t> method, which is the main method of the ExtractSequencesFromFolder class, detects anomalies in our data. It traverses each value in the list one by one in a sliding window manner, using the trained model predictor to predict the next element for comparison. An anomaly score is used to quantify the comparison, and if the prediction exceeds a certain tolerance level, it is flagged as an anomaly.</w:t>
       </w:r>
     </w:p>
     <w:p>
@@ -3122,35 +2304,7 @@
         <w:rPr>
           <w:lang w:val="en-GB"/>
         </w:rPr>
-        <w:t>We can obtain our prediction in a list of results in the format of </w:t>
-      </w:r>
-      <w:proofErr w:type="gramStart"/>
-      <w:r>
-        <w:rPr>
-          <w:lang w:val="en-GB"/>
-        </w:rPr>
-        <w:t>NeoCortexApi.Classifiers.ClassifierResult</w:t>
-      </w:r>
-      <w:proofErr w:type="gramEnd"/>
-      <w:r>
-        <w:rPr>
-          <w:lang w:val="en-GB"/>
-        </w:rPr>
-        <w:t>1[</w:t>
-      </w:r>
-      <w:proofErr w:type="spellStart"/>
-      <w:r>
-        <w:rPr>
-          <w:lang w:val="en-GB"/>
-        </w:rPr>
-        <w:t>System.String</w:t>
-      </w:r>
-      <w:proofErr w:type="spellEnd"/>
-      <w:r>
-        <w:rPr>
-          <w:lang w:val="en-GB"/>
-        </w:rPr>
-        <w:t>]` from our trained model predictor using the following method</w:t>
+        <w:t>We can obtain our prediction in a list of results in the format of NeoCortexApi.Classifiers.ClassifierResult1[System.String]` from our trained model predictor using the following method</w:t>
       </w:r>
       <w:r>
         <w:rPr>
@@ -3209,17 +2363,7 @@
                     <w:jc w:val="left"/>
                   </w:pPr>
                   <w:r>
-                    <w:t xml:space="preserve">var res = </w:t>
-                  </w:r>
-                  <w:proofErr w:type="spellStart"/>
-                  <w:proofErr w:type="gramStart"/>
-                  <w:r>
-                    <w:t>predictor.Predict</w:t>
-                  </w:r>
-                  <w:proofErr w:type="spellEnd"/>
-                  <w:proofErr w:type="gramEnd"/>
-                  <w:r>
-                    <w:t>(item);</w:t>
+                    <w:t>var res = predictor.Predict(item);</w:t>
                   </w:r>
                 </w:p>
               </w:txbxContent>
@@ -3400,15 +2544,7 @@
         <w:t xml:space="preserve"> </w:t>
       </w:r>
       <w:r>
-        <w:t xml:space="preserve">Process of </w:t>
-      </w:r>
-      <w:proofErr w:type="gramStart"/>
-      <w:r>
-        <w:t>anomalies</w:t>
-      </w:r>
-      <w:proofErr w:type="gramEnd"/>
-      <w:r>
-        <w:t xml:space="preserve"> determination </w:t>
+        <w:t xml:space="preserve">Process of anomalies determination </w:t>
       </w:r>
     </w:p>
     <w:p>
@@ -3426,25 +2562,7 @@
                     <w:jc w:val="left"/>
                   </w:pPr>
                   <w:r>
-                    <w:t>if (</w:t>
-                  </w:r>
-                  <w:proofErr w:type="spellStart"/>
-                  <w:r>
-                    <w:t>i</w:t>
-                  </w:r>
-                  <w:proofErr w:type="spellEnd"/>
-                  <w:r>
-                    <w:t xml:space="preserve"> &lt; </w:t>
-                  </w:r>
-                  <w:proofErr w:type="spellStart"/>
-                  <w:proofErr w:type="gramStart"/>
-                  <w:r>
-                    <w:t>sequence.Length</w:t>
-                  </w:r>
-                  <w:proofErr w:type="spellEnd"/>
-                  <w:proofErr w:type="gramEnd"/>
-                  <w:r>
-                    <w:t xml:space="preserve"> - 1)</w:t>
+                    <w:t>if (i &lt; sequence.Length - 1)</w:t>
                   </w:r>
                 </w:p>
                 <w:p>
@@ -3460,154 +2578,45 @@
                     <w:jc w:val="left"/>
                   </w:pPr>
                   <w:r>
-                    <w:t xml:space="preserve">         int </w:t>
-                  </w:r>
-                  <w:proofErr w:type="spellStart"/>
-                  <w:r>
-                    <w:t>nextIndex</w:t>
-                  </w:r>
-                  <w:proofErr w:type="spellEnd"/>
-                  <w:r>
-                    <w:t xml:space="preserve"> = </w:t>
-                  </w:r>
-                  <w:proofErr w:type="spellStart"/>
-                  <w:r>
-                    <w:t>i</w:t>
-                  </w:r>
-                  <w:proofErr w:type="spellEnd"/>
-                  <w:r>
-                    <w:t xml:space="preserve"> + </w:t>
-                  </w:r>
-                  <w:proofErr w:type="gramStart"/>
-                  <w:r>
-                    <w:t>1;</w:t>
-                  </w:r>
-                  <w:proofErr w:type="gramEnd"/>
-                </w:p>
-                <w:p>
-                  <w:pPr>
-                    <w:jc w:val="left"/>
-                  </w:pPr>
-                  <w:r>
-                    <w:t xml:space="preserve">         double </w:t>
-                  </w:r>
-                  <w:proofErr w:type="spellStart"/>
-                  <w:r>
-                    <w:t>nextItem</w:t>
-                  </w:r>
-                  <w:proofErr w:type="spellEnd"/>
-                  <w:r>
-                    <w:t xml:space="preserve"> = sequence[</w:t>
-                  </w:r>
-                  <w:proofErr w:type="spellStart"/>
-                  <w:r>
-                    <w:t>nextIndex</w:t>
-                  </w:r>
-                  <w:proofErr w:type="spellEnd"/>
-                  <w:proofErr w:type="gramStart"/>
-                  <w:r>
-                    <w:t>];</w:t>
-                  </w:r>
-                  <w:proofErr w:type="gramEnd"/>
-                </w:p>
-                <w:p>
-                  <w:pPr>
-                    <w:jc w:val="left"/>
-                  </w:pPr>
-                  <w:r>
-                    <w:t xml:space="preserve">         double </w:t>
-                  </w:r>
-                  <w:proofErr w:type="spellStart"/>
-                  <w:r>
-                    <w:t>predictedNextItem</w:t>
-                  </w:r>
-                  <w:proofErr w:type="spellEnd"/>
-                  <w:r>
-                    <w:t xml:space="preserve"> = </w:t>
-                  </w:r>
-                  <w:proofErr w:type="spellStart"/>
-                  <w:proofErr w:type="gramStart"/>
-                  <w:r>
-                    <w:t>double.Parse</w:t>
-                  </w:r>
-                  <w:proofErr w:type="spellEnd"/>
-                  <w:proofErr w:type="gramEnd"/>
-                  <w:r>
-                    <w:t>(tokens2.Last());</w:t>
-                  </w:r>
-                </w:p>
-                <w:p>
-                  <w:pPr>
-                    <w:jc w:val="left"/>
-                  </w:pPr>
-                </w:p>
-                <w:p>
-                  <w:pPr>
-                    <w:jc w:val="left"/>
-                  </w:pPr>
-                  <w:r>
-                    <w:t xml:space="preserve">         var </w:t>
-                  </w:r>
-                  <w:proofErr w:type="spellStart"/>
-                  <w:r>
-                    <w:t>anomalyScore</w:t>
-                  </w:r>
-                  <w:proofErr w:type="spellEnd"/>
-                  <w:r>
-                    <w:t xml:space="preserve"> = </w:t>
-                  </w:r>
-                  <w:proofErr w:type="spellStart"/>
-                  <w:r>
-                    <w:t>Math.Abs</w:t>
-                  </w:r>
-                  <w:proofErr w:type="spellEnd"/>
-                  <w:r>
-                    <w:t>(</w:t>
-                  </w:r>
-                  <w:proofErr w:type="spellStart"/>
-                  <w:r>
-                    <w:t>predictedNextItem</w:t>
-                  </w:r>
-                  <w:proofErr w:type="spellEnd"/>
-                  <w:r>
-                    <w:t xml:space="preserve"> - </w:t>
-                  </w:r>
-                  <w:proofErr w:type="spellStart"/>
-                  <w:r>
-                    <w:t>nextItem</w:t>
-                  </w:r>
-                  <w:proofErr w:type="spellEnd"/>
-                  <w:proofErr w:type="gramStart"/>
-                  <w:r>
-                    <w:t>);</w:t>
-                  </w:r>
-                  <w:proofErr w:type="gramEnd"/>
-                </w:p>
-                <w:p>
-                  <w:pPr>
-                    <w:jc w:val="left"/>
-                  </w:pPr>
-                  <w:r>
-                    <w:t xml:space="preserve">         var deviation = </w:t>
-                  </w:r>
-                  <w:proofErr w:type="spellStart"/>
-                  <w:r>
-                    <w:t>anomalyScore</w:t>
-                  </w:r>
-                  <w:proofErr w:type="spellEnd"/>
-                  <w:r>
-                    <w:t xml:space="preserve"> / </w:t>
-                  </w:r>
-                  <w:proofErr w:type="spellStart"/>
-                  <w:proofErr w:type="gramStart"/>
-                  <w:r>
-                    <w:t>nextItem</w:t>
-                  </w:r>
-                  <w:proofErr w:type="spellEnd"/>
-                  <w:r>
-                    <w:t>;</w:t>
-                  </w:r>
-                  <w:proofErr w:type="gramEnd"/>
+                    <w:t xml:space="preserve">         int nextIndex = i + 1;</w:t>
+                  </w:r>
+                </w:p>
+                <w:p>
+                  <w:pPr>
+                    <w:jc w:val="left"/>
+                  </w:pPr>
+                  <w:r>
+                    <w:t xml:space="preserve">         double nextItem = sequence[nextIndex];</w:t>
+                  </w:r>
+                </w:p>
+                <w:p>
+                  <w:pPr>
+                    <w:jc w:val="left"/>
+                  </w:pPr>
+                  <w:r>
+                    <w:t xml:space="preserve">         double predictedNextItem = double.Parse(tokens2.Last());</w:t>
+                  </w:r>
+                </w:p>
+                <w:p>
+                  <w:pPr>
+                    <w:jc w:val="left"/>
+                  </w:pPr>
+                </w:p>
+                <w:p>
+                  <w:pPr>
+                    <w:jc w:val="left"/>
+                  </w:pPr>
+                  <w:r>
+                    <w:t xml:space="preserve">         var anomalyScore = Math.Abs(predictedNextItem - nextItem);</w:t>
+                  </w:r>
+                </w:p>
+                <w:p>
+                  <w:pPr>
+                    <w:jc w:val="left"/>
+                  </w:pPr>
+                  <w:r>
+                    <w:t xml:space="preserve">         var deviation = anomalyScore / nextItem;</w:t>
+                  </w:r>
                 </w:p>
                 <w:p>
                   <w:pPr>
@@ -3635,42 +2644,16 @@
                     <w:jc w:val="left"/>
                   </w:pPr>
                   <w:r>
-                    <w:t xml:space="preserve">              </w:t>
-                  </w:r>
-                  <w:proofErr w:type="spellStart"/>
-                  <w:r>
-                    <w:t>resultOutputLines.Add</w:t>
-                  </w:r>
-                  <w:proofErr w:type="spellEnd"/>
-                  <w:r>
-                    <w:t>($"No anomaly detected in the next element. HTM Engine found similarity: {similarity}%."</w:t>
-                  </w:r>
-                  <w:proofErr w:type="gramStart"/>
-                  <w:r>
-                    <w:t>);</w:t>
-                  </w:r>
-                  <w:proofErr w:type="gramEnd"/>
-                </w:p>
-                <w:p>
-                  <w:pPr>
-                    <w:jc w:val="left"/>
-                  </w:pPr>
-                  <w:r>
-                    <w:t xml:space="preserve">              </w:t>
-                  </w:r>
-                  <w:proofErr w:type="spellStart"/>
-                  <w:r>
-                    <w:t>currentAccuracy</w:t>
-                  </w:r>
-                  <w:proofErr w:type="spellEnd"/>
-                  <w:r>
-                    <w:t xml:space="preserve"> += </w:t>
-                  </w:r>
-                  <w:proofErr w:type="gramStart"/>
-                  <w:r>
-                    <w:t>similarity;</w:t>
-                  </w:r>
-                  <w:proofErr w:type="gramEnd"/>
+                    <w:t xml:space="preserve">              resultOutputLines.Add($"No anomaly detected in the next element. HTM Engine found similarity: {similarity}%.");</w:t>
+                  </w:r>
+                </w:p>
+                <w:p>
+                  <w:pPr>
+                    <w:jc w:val="left"/>
+                  </w:pPr>
+                  <w:r>
+                    <w:t xml:space="preserve">              currentAccuracy += similarity;</w:t>
+                  </w:r>
                 </w:p>
                 <w:p>
                   <w:pPr>
@@ -3701,124 +2684,40 @@
                     <w:jc w:val="left"/>
                   </w:pPr>
                   <w:r>
-                    <w:t xml:space="preserve">              </w:t>
-                  </w:r>
-                  <w:proofErr w:type="spellStart"/>
-                  <w:r>
-                    <w:t>resultOutputLines.Add</w:t>
-                  </w:r>
-                  <w:proofErr w:type="spellEnd"/>
-                  <w:r>
-                    <w:t>($"****Anomaly detected**** in the next element. HTM Engine predicted: {</w:t>
-                  </w:r>
-                  <w:proofErr w:type="spellStart"/>
-                  <w:r>
-                    <w:t>predictedNextItem</w:t>
-                  </w:r>
-                  <w:proofErr w:type="spellEnd"/>
-                  <w:r>
-                    <w:t>} with similarity: {similarity}%, actual value: {</w:t>
-                  </w:r>
-                  <w:proofErr w:type="spellStart"/>
-                  <w:r>
-                    <w:t>nextItem</w:t>
-                  </w:r>
-                  <w:proofErr w:type="spellEnd"/>
-                  <w:r>
-                    <w:t>}."</w:t>
-                  </w:r>
-                  <w:proofErr w:type="gramStart"/>
-                  <w:r>
-                    <w:t>);</w:t>
-                  </w:r>
-                  <w:proofErr w:type="gramEnd"/>
-                </w:p>
-                <w:p>
-                  <w:pPr>
-                    <w:jc w:val="left"/>
-                  </w:pPr>
-                  <w:r>
-                    <w:t xml:space="preserve">              </w:t>
-                  </w:r>
-                  <w:proofErr w:type="spellStart"/>
-                  <w:r>
-                    <w:t>anomalousIndex.Add</w:t>
-                  </w:r>
-                  <w:proofErr w:type="spellEnd"/>
-                  <w:r>
-                    <w:t>(</w:t>
-                  </w:r>
-                  <w:proofErr w:type="spellStart"/>
-                  <w:r>
-                    <w:t>i</w:t>
-                  </w:r>
-                  <w:proofErr w:type="spellEnd"/>
-                  <w:r>
-                    <w:t xml:space="preserve"> + 1</w:t>
-                  </w:r>
-                  <w:proofErr w:type="gramStart"/>
-                  <w:r>
-                    <w:t>);</w:t>
-                  </w:r>
-                  <w:proofErr w:type="gramEnd"/>
-                </w:p>
-                <w:p>
-                  <w:pPr>
-                    <w:jc w:val="left"/>
-                  </w:pPr>
-                  <w:r>
-                    <w:t xml:space="preserve">              </w:t>
-                  </w:r>
-                  <w:proofErr w:type="spellStart"/>
-                  <w:r>
-                    <w:t>i</w:t>
-                  </w:r>
-                  <w:proofErr w:type="spellEnd"/>
-                  <w:r>
-                    <w:t>++; // Skip the anomalous element</w:t>
-                  </w:r>
-                </w:p>
-                <w:p>
-                  <w:pPr>
-                    <w:jc w:val="left"/>
-                  </w:pPr>
-                  <w:r>
-                    <w:t xml:space="preserve">              </w:t>
-                  </w:r>
-                  <w:proofErr w:type="spellStart"/>
-                  <w:r>
-                    <w:t>resultOutputLines.Add</w:t>
-                  </w:r>
-                  <w:proofErr w:type="spellEnd"/>
-                  <w:r>
-                    <w:t>("Skipping to the next element in the testing sequence."</w:t>
-                  </w:r>
-                  <w:proofErr w:type="gramStart"/>
-                  <w:r>
-                    <w:t>);</w:t>
-                  </w:r>
-                  <w:proofErr w:type="gramEnd"/>
-                </w:p>
-                <w:p>
-                  <w:pPr>
-                    <w:jc w:val="left"/>
-                  </w:pPr>
-                  <w:r>
-                    <w:t xml:space="preserve">              </w:t>
-                  </w:r>
-                  <w:proofErr w:type="spellStart"/>
-                  <w:r>
-                    <w:t>currentAccuracy</w:t>
-                  </w:r>
-                  <w:proofErr w:type="spellEnd"/>
-                  <w:r>
-                    <w:t xml:space="preserve"> += </w:t>
-                  </w:r>
-                  <w:proofErr w:type="gramStart"/>
-                  <w:r>
-                    <w:t>similarity;</w:t>
-                  </w:r>
-                  <w:proofErr w:type="gramEnd"/>
+                    <w:t xml:space="preserve">              resultOutputLines.Add($"****Anomaly detected**** in the next element. HTM Engine predicted: {predictedNextItem} with similarity: {similarity}%, actual value: {nextItem}.");</w:t>
+                  </w:r>
+                </w:p>
+                <w:p>
+                  <w:pPr>
+                    <w:jc w:val="left"/>
+                  </w:pPr>
+                  <w:r>
+                    <w:t xml:space="preserve">              anomalousIndex.Add(i + 1);</w:t>
+                  </w:r>
+                </w:p>
+                <w:p>
+                  <w:pPr>
+                    <w:jc w:val="left"/>
+                  </w:pPr>
+                  <w:r>
+                    <w:t xml:space="preserve">              i++; // Skip the anomalous element</w:t>
+                  </w:r>
+                </w:p>
+                <w:p>
+                  <w:pPr>
+                    <w:jc w:val="left"/>
+                  </w:pPr>
+                  <w:r>
+                    <w:t xml:space="preserve">              resultOutputLines.Add("Skipping to the next element in the testing sequence.");</w:t>
+                  </w:r>
+                </w:p>
+                <w:p>
+                  <w:pPr>
+                    <w:jc w:val="left"/>
+                  </w:pPr>
+                  <w:r>
+                    <w:t xml:space="preserve">              currentAccuracy += similarity;</w:t>
+                  </w:r>
                 </w:p>
                 <w:p>
                   <w:pPr>
@@ -3897,47 +2796,19 @@
         <w:rPr>
           <w:lang w:val="en-GB"/>
         </w:rPr>
-        <w:t xml:space="preserve">We use </w:t>
-      </w:r>
-      <w:proofErr w:type="spellStart"/>
+        <w:t xml:space="preserve">We use accuracyPerList to record accuracy per numerical sequence tested. </w:t>
+      </w:r>
       <w:r>
         <w:rPr>
           <w:lang w:val="en-GB"/>
         </w:rPr>
-        <w:t>accuracyPerList</w:t>
-      </w:r>
-      <w:proofErr w:type="spellEnd"/>
+        <w:t>record Accuracy</w:t>
+      </w:r>
       <w:r>
         <w:rPr>
           <w:lang w:val="en-GB"/>
         </w:rPr>
-        <w:t xml:space="preserve"> to record accuracy per numerical sequence tested. </w:t>
-      </w:r>
-      <w:r>
-        <w:rPr>
-          <w:lang w:val="en-GB"/>
-        </w:rPr>
-        <w:t>record Accuracy</w:t>
-      </w:r>
-      <w:r>
-        <w:rPr>
-          <w:lang w:val="en-GB"/>
-        </w:rPr>
-        <w:t xml:space="preserve"> is collected from inside each loop run, which indicates HTM model´s accuracy. We also add index positions of anomalies to </w:t>
-      </w:r>
-      <w:proofErr w:type="spellStart"/>
-      <w:r>
-        <w:rPr>
-          <w:lang w:val="en-GB"/>
-        </w:rPr>
-        <w:t>anomalyIndices</w:t>
-      </w:r>
-      <w:proofErr w:type="spellEnd"/>
-      <w:r>
-        <w:rPr>
-          <w:lang w:val="en-GB"/>
-        </w:rPr>
-        <w:t xml:space="preserve">, when we encounter indices of anomalies in loop. </w:t>
+        <w:t xml:space="preserve"> is collected from inside each loop run, which indicates HTM model´s accuracy. We also add index positions of anomalies to anomalyIndices, when we encounter indices of anomalies in loop. </w:t>
       </w:r>
       <w:r>
         <w:rPr>
@@ -3982,21 +2853,8 @@
         <w:t>After that w</w:t>
       </w:r>
       <w:r>
-        <w:t xml:space="preserve">e use static variables to access these from outside, </w:t>
-      </w:r>
-      <w:proofErr w:type="spellStart"/>
-      <w:r>
-        <w:t>i.e</w:t>
-      </w:r>
-      <w:proofErr w:type="spellEnd"/>
-      <w:r>
-        <w:t xml:space="preserve">: in </w:t>
-      </w:r>
-      <w:proofErr w:type="spellStart"/>
-      <w:r>
-        <w:t>Program.cs</w:t>
-      </w:r>
-      <w:proofErr w:type="spellEnd"/>
+        <w:t>e use static variables to access these from outside, i.e: in Program.cs</w:t>
+      </w:r>
       <w:r>
         <w:t xml:space="preserve"> [Listing 1</w:t>
       </w:r>
@@ -4047,43 +2905,9 @@
                   <w:pPr>
                     <w:jc w:val="left"/>
                   </w:pPr>
-                  <w:proofErr w:type="spellStart"/>
-                  <w:r>
-                    <w:t>StoredOutputValues.totalAvgAccuracy</w:t>
-                  </w:r>
-                  <w:proofErr w:type="spellEnd"/>
-                  <w:r>
-                    <w:t xml:space="preserve"> = _</w:t>
-                  </w:r>
-                  <w:proofErr w:type="spellStart"/>
-                  <w:r>
-                    <w:t>totalAccuracy</w:t>
-                  </w:r>
-                  <w:proofErr w:type="spellEnd"/>
-                  <w:r>
-                    <w:t xml:space="preserve"> / </w:t>
-                  </w:r>
-                  <w:proofErr w:type="spellStart"/>
-                  <w:r>
-                    <w:t>Math.Max</w:t>
-                  </w:r>
-                  <w:proofErr w:type="spellEnd"/>
-                  <w:r>
-                    <w:t>(_</w:t>
-                  </w:r>
-                  <w:proofErr w:type="spellStart"/>
-                  <w:r>
-                    <w:t>iterationCount</w:t>
-                  </w:r>
-                  <w:proofErr w:type="spellEnd"/>
-                  <w:r>
-                    <w:t>, 1</w:t>
-                  </w:r>
-                  <w:proofErr w:type="gramStart"/>
-                  <w:r>
-                    <w:t>);</w:t>
-                  </w:r>
-                  <w:proofErr w:type="gramEnd"/>
+                  <w:r>
+                    <w:t>StoredOutputValues.totalAvgAccuracy = _totalAccuracy / Math.Max(_iterationCount, 1);</w:t>
+                  </w:r>
                 </w:p>
               </w:txbxContent>
             </v:textbox>
@@ -4104,17 +2928,9 @@
         <w:jc w:val="both"/>
       </w:pPr>
       <w:r>
-        <w:t xml:space="preserve">The </w:t>
-      </w:r>
-      <w:proofErr w:type="spellStart"/>
-      <w:r>
-        <w:t>SequenceVisualizer</w:t>
-      </w:r>
-      <w:proofErr w:type="spellEnd"/>
-      <w:r>
-        <w:t> </w:t>
-      </w:r>
-      <w:hyperlink r:id="rId11" w:history="1">
+        <w:t>The SequenceVisualizer </w:t>
+      </w:r>
+      <w:hyperlink r:id="rId13" w:history="1">
         <w:r>
           <w:rPr>
             <w:rStyle w:val="Hyperlink"/>
@@ -4123,15 +2939,7 @@
         </w:r>
       </w:hyperlink>
       <w:r>
-        <w:t xml:space="preserve"> is used to plot graphs of sequences of data and their anomalies. This class used to </w:t>
-      </w:r>
-      <w:proofErr w:type="gramStart"/>
-      <w:r>
-        <w:t>showing</w:t>
-      </w:r>
-      <w:proofErr w:type="gramEnd"/>
-      <w:r>
-        <w:t xml:space="preserve"> the visual result for detecting anomalies </w:t>
+        <w:t xml:space="preserve"> is used to plot graphs of sequences of data and their anomalies. This class used to showing the visual result for detecting anomalies </w:t>
       </w:r>
       <w:r>
         <w:t>compared</w:t>
@@ -4191,36 +2999,7 @@
                     <w:jc w:val="left"/>
                   </w:pPr>
                   <w:r>
-                    <w:t xml:space="preserve">public static void </w:t>
-                  </w:r>
-                  <w:proofErr w:type="spellStart"/>
-                  <w:proofErr w:type="gramStart"/>
-                  <w:r>
-                    <w:t>CreateGraphForSequences</w:t>
-                  </w:r>
-                  <w:proofErr w:type="spellEnd"/>
-                  <w:r>
-                    <w:t>(</w:t>
-                  </w:r>
-                  <w:proofErr w:type="gramEnd"/>
-                  <w:r>
-                    <w:t xml:space="preserve">List&lt;double[]&gt; </w:t>
-                  </w:r>
-                  <w:proofErr w:type="spellStart"/>
-                  <w:r>
-                    <w:t>allLearnedData</w:t>
-                  </w:r>
-                  <w:proofErr w:type="spellEnd"/>
-                  <w:r>
-                    <w:t xml:space="preserve">, List&lt;double[]&gt; </w:t>
-                  </w:r>
-                  <w:proofErr w:type="spellStart"/>
-                  <w:r>
-                    <w:t>allTestingData</w:t>
-                  </w:r>
-                  <w:proofErr w:type="spellEnd"/>
-                  <w:r>
-                    <w:t>)</w:t>
+                    <w:t>public static void CreateGraphForSequences(List&lt;double[]&gt; allLearnedData, List&lt;double[]&gt; allTestingData)</w:t>
                   </w:r>
                 </w:p>
                 <w:p>
@@ -4235,47 +3014,17 @@
                   <w:pPr>
                     <w:jc w:val="left"/>
                   </w:pPr>
-                  <w:proofErr w:type="spellStart"/>
-                  <w:r>
-                    <w:t>allGraphs.Add</w:t>
-                  </w:r>
-                  <w:proofErr w:type="spellEnd"/>
-                  <w:r>
-                    <w:t>(</w:t>
-                  </w:r>
-                  <w:proofErr w:type="spellStart"/>
-                  <w:r>
-                    <w:t>actualGraph</w:t>
-                  </w:r>
-                  <w:proofErr w:type="spellEnd"/>
-                  <w:proofErr w:type="gramStart"/>
-                  <w:r>
-                    <w:t>);</w:t>
-                  </w:r>
-                  <w:proofErr w:type="gramEnd"/>
-                </w:p>
-                <w:p>
-                  <w:pPr>
-                    <w:jc w:val="left"/>
-                  </w:pPr>
-                  <w:proofErr w:type="spellStart"/>
-                  <w:r>
-                    <w:t>allGraphs.Add</w:t>
-                  </w:r>
-                  <w:proofErr w:type="spellEnd"/>
-                  <w:r>
-                    <w:t>(</w:t>
-                  </w:r>
-                  <w:proofErr w:type="spellStart"/>
-                  <w:r>
-                    <w:t>learnedGraph</w:t>
-                  </w:r>
-                  <w:proofErr w:type="spellEnd"/>
-                  <w:proofErr w:type="gramStart"/>
-                  <w:r>
-                    <w:t>);</w:t>
-                  </w:r>
-                  <w:proofErr w:type="gramEnd"/>
+                  <w:r>
+                    <w:t>allGraphs.Add(actualGraph);</w:t>
+                  </w:r>
+                </w:p>
+                <w:p>
+                  <w:pPr>
+                    <w:jc w:val="left"/>
+                  </w:pPr>
+                  <w:r>
+                    <w:t>allGraphs.Add(learnedGraph);</w:t>
+                  </w:r>
                 </w:p>
                 <w:p>
                   <w:pPr>
@@ -4290,26 +3039,8 @@
                     <w:jc w:val="left"/>
                   </w:pPr>
                   <w:r>
-                    <w:t xml:space="preserve">var chart = </w:t>
-                  </w:r>
-                  <w:proofErr w:type="spellStart"/>
-                  <w:r>
-                    <w:t>Chart.Plot</w:t>
-                  </w:r>
-                  <w:proofErr w:type="spellEnd"/>
-                  <w:r>
-                    <w:t>(</w:t>
-                  </w:r>
-                  <w:proofErr w:type="spellStart"/>
-                  <w:r>
-                    <w:t>allGraphs</w:t>
-                  </w:r>
-                  <w:proofErr w:type="spellEnd"/>
-                  <w:proofErr w:type="gramStart"/>
-                  <w:r>
-                    <w:t>);</w:t>
-                  </w:r>
-                  <w:proofErr w:type="gramEnd"/>
+                    <w:t>var chart = Chart.Plot(allGraphs);</w:t>
+                  </w:r>
                 </w:p>
               </w:txbxContent>
             </v:textbox>
@@ -4338,7 +3069,7 @@
       <w:r>
         <w:t xml:space="preserve"> the unit tests, we ensured the behavior of detection of anomalies in the project. Project files for the units test can be found </w:t>
       </w:r>
-      <w:hyperlink r:id="rId12" w:history="1">
+      <w:hyperlink r:id="rId14" w:history="1">
         <w:r>
           <w:rPr>
             <w:rStyle w:val="Hyperlink"/>
@@ -4372,7 +3103,7 @@
         </w:rPr>
         <w:t>Once the experiment concludes, the anomaly detection results persisted to the screen, along with HTM accuracy for each individual number sequences and overall HTM accuracy for the whole experiment. We have uploaded the anomaly results of our data in this repository for reference. output result of combined numerical sequence data from training folder (without anomalies) and predicting folder (with anomalies) can be found </w:t>
       </w:r>
-      <w:hyperlink r:id="rId13" w:history="1">
+      <w:hyperlink r:id="rId15" w:history="1">
         <w:r>
           <w:rPr>
             <w:rStyle w:val="Hyperlink"/>
@@ -4422,7 +3153,7 @@
         </w:rPr>
         <w:t>We showed the graphical view of the training and predicting sequences along with anomalies. After successfully running the projects, we are generating the plots in html format in the browser as well as saving the files in the output graph </w:t>
       </w:r>
-      <w:hyperlink r:id="rId14" w:history="1">
+      <w:hyperlink r:id="rId16" w:history="1">
         <w:r>
           <w:rPr>
             <w:rStyle w:val="Hyperlink"/>
@@ -4514,7 +3245,7 @@
             <o:lock v:ext="edit" aspectratio="t"/>
           </v:shapetype>
           <v:shape id="_x0000_i1040" type="#_x0000_t75" style="width:242.4pt;height:129pt">
-            <v:imagedata r:id="rId15" o:title="427799498-24943024-cb4c-498a-bbf3-8043b8e9190d"/>
+            <v:imagedata r:id="rId17" o:title="427799498-24943024-cb4c-498a-bbf3-8043b8e9190d"/>
           </v:shape>
         </w:pict>
       </w:r>
@@ -4595,7 +3326,7 @@
       <w:r>
         <w:pict w14:anchorId="2D840C25">
           <v:shape id="_x0000_i1041" type="#_x0000_t75" style="width:234.6pt;height:126pt">
-            <v:imagedata r:id="rId16" o:title="427799422-0926d42e-52fd-4abb-a505-f331dc5e245f"/>
+            <v:imagedata r:id="rId18" o:title="427799422-0926d42e-52fd-4abb-a505-f331dc5e245f"/>
           </v:shape>
         </w:pict>
       </w:r>
@@ -4711,35 +3442,7 @@
         <w:rPr>
           <w:lang w:val="en-GB"/>
         </w:rPr>
-        <w:t xml:space="preserve">We can observe that the False Negative </w:t>
-      </w:r>
-      <w:proofErr w:type="gramStart"/>
-      <w:r>
-        <w:rPr>
-          <w:lang w:val="en-GB"/>
-        </w:rPr>
-        <w:t>Rate(</w:t>
-      </w:r>
-      <w:proofErr w:type="gramEnd"/>
-      <w:r>
-        <w:rPr>
-          <w:lang w:val="en-GB"/>
-        </w:rPr>
-        <w:t xml:space="preserve">FNR) is in our output (0.22). It is desired that the false negative rate should be as lower as possible in an anomaly detection program. Lower false positive rate is also desirable, but not </w:t>
-      </w:r>
-      <w:proofErr w:type="gramStart"/>
-      <w:r>
-        <w:rPr>
-          <w:lang w:val="en-GB"/>
-        </w:rPr>
-        <w:t>absolutely essential</w:t>
-      </w:r>
-      <w:proofErr w:type="gramEnd"/>
-      <w:r>
-        <w:rPr>
-          <w:lang w:val="en-GB"/>
-        </w:rPr>
-        <w:t>.</w:t>
+        <w:t>We can observe that the False Negative Rate(FNR) is in our output (0.22). It is desired that the false negative rate should be as lower as possible in an anomaly detection program. Lower false positive rate is also desirable, but not absolutely essential.</w:t>
       </w:r>
     </w:p>
     <w:p>
@@ -4754,35 +3457,7 @@
         <w:rPr>
           <w:lang w:val="en-GB"/>
         </w:rPr>
-        <w:t xml:space="preserve">Although, it depends on </w:t>
-      </w:r>
-      <w:proofErr w:type="gramStart"/>
-      <w:r>
-        <w:rPr>
-          <w:lang w:val="en-GB"/>
-        </w:rPr>
-        <w:t>a number of</w:t>
-      </w:r>
-      <w:proofErr w:type="gramEnd"/>
-      <w:r>
-        <w:rPr>
-          <w:lang w:val="en-GB"/>
-        </w:rPr>
-        <w:t xml:space="preserve"> factors, like quantity (the more, the better) and quality of data, and hyperparameters used to tune and train model; more data should be used for training, and hyperparameters should be further tuned to find the most optimal setting for training to get the best results. We were using </w:t>
-      </w:r>
-      <w:proofErr w:type="gramStart"/>
-      <w:r>
-        <w:rPr>
-          <w:lang w:val="en-GB"/>
-        </w:rPr>
-        <w:t>less</w:t>
-      </w:r>
-      <w:proofErr w:type="gramEnd"/>
-      <w:r>
-        <w:rPr>
-          <w:lang w:val="en-GB"/>
-        </w:rPr>
-        <w:t xml:space="preserve"> number of numerical sequences as data to demonstrate our sample project due to time and computational constraints, but that can be improved if we use better resources, like cloud.</w:t>
+        <w:t>Although, it depends on a number of factors, like quantity (the more, the better) and quality of data, and hyperparameters used to tune and train model; more data should be used for training, and hyperparameters should be further tuned to find the most optimal setting for training to get the best results. We were using less number of numerical sequences as data to demonstrate our sample project due to time and computational constraints, but that can be improved if we use better resources, like cloud.</w:t>
       </w:r>
     </w:p>
     <w:p>
@@ -4818,21 +3493,7 @@
         <w:rPr>
           <w:lang w:val="en-US"/>
         </w:rPr>
-        <w:t xml:space="preserve">Our experiment demonstrated varying accuracy levels, influenced by computational limitations. Testing was conducted on a local machine with a smaller dataset due to </w:t>
-      </w:r>
-      <w:proofErr w:type="gramStart"/>
-      <w:r>
-        <w:rPr>
-          <w:lang w:val="en-US"/>
-        </w:rPr>
-        <w:t>resource</w:t>
-      </w:r>
-      <w:proofErr w:type="gramEnd"/>
-      <w:r>
-        <w:rPr>
-          <w:lang w:val="en-US"/>
-        </w:rPr>
-        <w:t xml:space="preserve"> and time constraints. Utilizing more powerful computing resources, such as cloud platforms, can enhance performance. Additionally, increasing the dataset size and fine-tuning hyperparameters can further optimize the model’s accuracy</w:t>
+        <w:t>Our experiment demonstrated varying accuracy levels, influenced by computational limitations. Testing was conducted on a local machine with a smaller dataset due to resource and time constraints. Utilizing more powerful computing resources, such as cloud platforms, can enhance performance. Additionally, increasing the dataset size and fine-tuning hyperparameters can further optimize the model’s accuracy</w:t>
       </w:r>
       <w:r>
         <w:rPr>
@@ -4889,7 +3550,7 @@
         <w:lastRenderedPageBreak/>
         <w:t xml:space="preserve">J. Wu, W. Zeng, and F. Yan, “Hierarchical Temporal Memory method for time-series-based anomaly detection,” Neurocomputing, vol. 273, pp. 535–546, Jan. 2018, doi: </w:t>
       </w:r>
-      <w:hyperlink r:id="rId17" w:history="1">
+      <w:hyperlink r:id="rId19" w:history="1">
         <w:r>
           <w:t>https://doi.org/10.1016/j.neucom.2017.08.026</w:t>
         </w:r>

</xml_diff>

<commit_message>
Modifications done based on review
</commit_message>
<xml_diff>
--- a/source/MySEProject/Documentations/ML 2425-03 Implement Anomaly Detection Sample.docx
+++ b/source/MySEProject/Documentations/ML 2425-03 Implement Anomaly Detection Sample.docx
@@ -304,13 +304,7 @@
         <w:rPr>
           <w:lang w:val="en-US"/>
         </w:rPr>
-        <w:t>, where he explored how intelligent systems could replicate the brain's ability to learn sequences, make predictions, and adapt over time.</w:t>
-      </w:r>
-      <w:r>
-        <w:rPr>
-          <w:lang w:val="en-US"/>
-        </w:rPr>
-        <w:t xml:space="preserve"> </w:t>
+        <w:t xml:space="preserve">, where he explored how intelligent systems could replicate the brain's ability to learn sequences, make predictions, and adapt over time. </w:t>
       </w:r>
       <w:r>
         <w:rPr>
@@ -687,7 +681,21 @@
         <w:pStyle w:val="BodyText"/>
       </w:pPr>
       <w:r>
-        <w:t>Below, we provide insight into the structure and content of our data sequences, summarize within these JSON files. This systematic arrangement ensures clarity and accessibility throughout our analysis and model development efforts. Our JSON structure is like the data given below:</w:t>
+        <w:t>Below, we provide insight into the structure and content of our data sequences, summarize within these JSON files. This systematic arrangement ensures clarity and accessibility throughout our analysis and model development efforts. Our JSON structure is like the data given below</w:t>
+      </w:r>
+      <w:r>
+        <w:t xml:space="preserve"> </w:t>
+      </w:r>
+      <w:hyperlink r:id="rId11" w:history="1">
+        <w:r>
+          <w:rPr>
+            <w:rStyle w:val="Hyperlink"/>
+          </w:rPr>
+          <w:t>dataset 1</w:t>
+        </w:r>
+      </w:hyperlink>
+      <w:r>
+        <w:t>:</w:t>
       </w:r>
     </w:p>
     <w:p>
@@ -727,9 +735,9 @@
         <mc:AlternateContent>
           <mc:Choice Requires="wps">
             <w:drawing>
-              <wp:inline distT="0" distB="0" distL="0" distR="0" wp14:anchorId="518885C6" wp14:editId="37452CCD">
-                <wp:extent cx="2887345" cy="1315085"/>
-                <wp:effectExtent l="13335" t="5715" r="13970" b="12700"/>
+              <wp:inline distT="0" distB="0" distL="0" distR="0" wp14:anchorId="518885C6" wp14:editId="4E067927">
+                <wp:extent cx="2903220" cy="1120140"/>
+                <wp:effectExtent l="0" t="0" r="11430" b="22860"/>
                 <wp:docPr id="2011549366" name="Text Box 17"/>
                 <wp:cNvGraphicFramePr>
                   <a:graphicFrameLocks xmlns:a="http://schemas.openxmlformats.org/drawingml/2006/main"/>
@@ -743,7 +751,7 @@
                       <wps:spPr bwMode="auto">
                         <a:xfrm>
                           <a:off x="0" y="0"/>
-                          <a:ext cx="2887345" cy="1315085"/>
+                          <a:ext cx="2903220" cy="1120140"/>
                         </a:xfrm>
                         <a:prstGeom prst="rect">
                           <a:avLst/>
@@ -847,7 +855,7 @@
                 <v:stroke joinstyle="miter"/>
                 <v:path gradientshapeok="t" o:connecttype="rect"/>
               </v:shapetype>
-              <v:shape id="Text Box 17" o:spid="_x0000_s1026" type="#_x0000_t202" style="width:227.35pt;height:103.55pt;visibility:visible;mso-wrap-style:square;mso-left-percent:-10001;mso-top-percent:-10001;mso-position-horizontal:absolute;mso-position-horizontal-relative:char;mso-position-vertical:absolute;mso-position-vertical-relative:line;mso-left-percent:-10001;mso-top-percent:-10001;v-text-anchor:top" o:gfxdata="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" filled="f">
+              <v:shape id="Text Box 17" o:spid="_x0000_s1026" type="#_x0000_t202" style="width:228.6pt;height:88.2pt;visibility:visible;mso-wrap-style:square;mso-left-percent:-10001;mso-top-percent:-10001;mso-position-horizontal:absolute;mso-position-horizontal-relative:char;mso-position-vertical:absolute;mso-position-vertical-relative:line;mso-left-percent:-10001;mso-top-percent:-10001;v-text-anchor:top" o:gfxdata="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" filled="f">
                 <v:textbox>
                   <w:txbxContent>
                     <w:p>
@@ -961,10 +969,7 @@
         <w:t xml:space="preserve"> folder in the repository</w:t>
       </w:r>
       <w:r>
-        <w:t xml:space="preserve"> inside </w:t>
-      </w:r>
-      <w:r>
-        <w:t>this folder</w:t>
+        <w:t xml:space="preserve"> inside this folder</w:t>
       </w:r>
       <w:r>
         <w:rPr>
@@ -982,80 +987,71 @@
         <w:t>used datasets</w:t>
       </w:r>
       <w:r>
-        <w:t xml:space="preserve"> folders we can use the datasets when we need</w:t>
-      </w:r>
-      <w:r>
-        <w:t xml:space="preserve">, we take them from these folders and insert the data into the </w:t>
-      </w:r>
-      <w:proofErr w:type="spellStart"/>
-      <w:r>
-        <w:t>training_files</w:t>
-      </w:r>
-      <w:proofErr w:type="spellEnd"/>
+        <w:t xml:space="preserve"> folders we can use the datasets when </w:t>
+      </w:r>
+      <w:r>
+        <w:t>we need</w:t>
+      </w:r>
+      <w:r>
+        <w:t xml:space="preserve">, we take them from these folders and insert the data into the training_files </w:t>
+      </w:r>
+      <w:r>
+        <w:t>and predicting_files folders.</w:t>
+      </w:r>
+    </w:p>
+    <w:p>
+      <w:pPr>
+        <w:pStyle w:val="BodyText"/>
+      </w:pPr>
+      <w:r>
+        <w:t xml:space="preserve">  </w:t>
+      </w:r>
+      <w:r>
+        <w:rPr>
+          <w:lang w:val="en-US"/>
+        </w:rPr>
+        <w:t>Here</w:t>
+      </w:r>
+      <w:r>
+        <w:t xml:space="preserve"> are also 4 files each file has 5 sequences where each sequence has 10 numerical data (means 10 days temperature value) for training, which is located in the training_</w:t>
+      </w:r>
+      <w:r>
+        <w:t>sequence</w:t>
+      </w:r>
+      <w:r>
+        <w:t xml:space="preserve"> folder, and also 4 files each file has 5 sequences where each sequence has 10 numerical data (means 10 days temperature value) for predicting which is located in the predicting_</w:t>
+      </w:r>
+      <w:r>
+        <w:t>sequence</w:t>
+      </w:r>
+      <w:r>
+        <w:t xml:space="preserve"> folder. We too</w:t>
+      </w:r>
+      <w:r>
+        <w:t xml:space="preserve">k a total of </w:t>
+      </w:r>
+      <w:r>
+        <w:t>20</w:t>
+      </w:r>
+      <w:r>
+        <w:t xml:space="preserve"> days of data. </w:t>
+      </w:r>
+      <w:r>
+        <w:t>Our Dataset structure is like the data given below</w:t>
+      </w:r>
       <w:r>
         <w:t xml:space="preserve"> </w:t>
       </w:r>
-      <w:r>
-        <w:t xml:space="preserve">and </w:t>
-      </w:r>
-      <w:proofErr w:type="spellStart"/>
-      <w:r>
-        <w:t>predicting_files</w:t>
-      </w:r>
-      <w:proofErr w:type="spellEnd"/>
-      <w:r>
-        <w:t xml:space="preserve"> folders.</w:t>
-      </w:r>
-    </w:p>
-    <w:p>
-      <w:pPr>
-        <w:pStyle w:val="BodyText"/>
-      </w:pPr>
-      <w:r>
-        <w:t xml:space="preserve">  </w:t>
-      </w:r>
-      <w:r>
-        <w:rPr>
-          <w:lang w:val="en-US"/>
-        </w:rPr>
-        <w:t>Here</w:t>
-      </w:r>
-      <w:r>
-        <w:t xml:space="preserve"> are also 4 files each file has 5 sequences where each sequence has 10 numerical data (means 10 days temperature value) for training, which is located in the </w:t>
-      </w:r>
-      <w:proofErr w:type="spellStart"/>
-      <w:r>
-        <w:t>training_</w:t>
-      </w:r>
-      <w:r>
-        <w:t>sequence</w:t>
-      </w:r>
-      <w:proofErr w:type="spellEnd"/>
-      <w:r>
-        <w:t xml:space="preserve"> folder, and also 4 files each file has 5 sequences where each sequence has 10 numerical data (means 10 days temperature value) for predicting which is located in the </w:t>
-      </w:r>
-      <w:proofErr w:type="spellStart"/>
-      <w:r>
-        <w:t>predicting_</w:t>
-      </w:r>
-      <w:r>
-        <w:t>sequence</w:t>
-      </w:r>
-      <w:proofErr w:type="spellEnd"/>
-      <w:r>
-        <w:t xml:space="preserve"> folder. We too</w:t>
-      </w:r>
-      <w:r>
-        <w:t xml:space="preserve">k a total of </w:t>
-      </w:r>
-      <w:r>
-        <w:t>20</w:t>
-      </w:r>
-      <w:r>
-        <w:t xml:space="preserve"> days of data. </w:t>
-      </w:r>
-      <w:r>
-        <w:t xml:space="preserve">Our Dataset structure is like the data given below: </w:t>
+      <w:hyperlink r:id="rId12" w:history="1">
+        <w:r>
+          <w:rPr>
+            <w:rStyle w:val="Hyperlink"/>
+          </w:rPr>
+          <w:t>dataset 2</w:t>
+        </w:r>
+      </w:hyperlink>
+      <w:r>
+        <w:t xml:space="preserve">: </w:t>
       </w:r>
     </w:p>
     <w:p>
@@ -1086,9 +1082,9 @@
         <mc:AlternateContent>
           <mc:Choice Requires="wps">
             <w:drawing>
-              <wp:inline distT="0" distB="0" distL="0" distR="0" wp14:anchorId="5CF21FF8" wp14:editId="03900D10">
-                <wp:extent cx="2887345" cy="1400175"/>
-                <wp:effectExtent l="9525" t="6350" r="8255" b="12700"/>
+              <wp:inline distT="0" distB="0" distL="0" distR="0" wp14:anchorId="5CF21FF8" wp14:editId="68E64729">
+                <wp:extent cx="2931795" cy="1136650"/>
+                <wp:effectExtent l="0" t="0" r="20955" b="25400"/>
                 <wp:docPr id="1827009922" name="Text Box 16"/>
                 <wp:cNvGraphicFramePr>
                   <a:graphicFrameLocks xmlns:a="http://schemas.openxmlformats.org/drawingml/2006/main"/>
@@ -1102,7 +1098,7 @@
                       <wps:spPr bwMode="auto">
                         <a:xfrm>
                           <a:off x="0" y="0"/>
-                          <a:ext cx="2887345" cy="1400175"/>
+                          <a:ext cx="2931795" cy="1136650"/>
                         </a:xfrm>
                         <a:prstGeom prst="rect">
                           <a:avLst/>
@@ -1209,7 +1205,7 @@
           </mc:Choice>
           <mc:Fallback>
             <w:pict>
-              <v:shape w14:anchorId="5CF21FF8" id="Text Box 16" o:spid="_x0000_s1027" type="#_x0000_t202" style="width:227.35pt;height:110.25pt;visibility:visible;mso-wrap-style:square;mso-left-percent:-10001;mso-top-percent:-10001;mso-position-horizontal:absolute;mso-position-horizontal-relative:char;mso-position-vertical:absolute;mso-position-vertical-relative:line;mso-left-percent:-10001;mso-top-percent:-10001;v-text-anchor:top" o:gfxdata="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" filled="f">
+              <v:shape w14:anchorId="5CF21FF8" id="Text Box 16" o:spid="_x0000_s1027" type="#_x0000_t202" style="width:230.85pt;height:89.5pt;visibility:visible;mso-wrap-style:square;mso-left-percent:-10001;mso-top-percent:-10001;mso-position-horizontal:absolute;mso-position-horizontal-relative:char;mso-position-vertical:absolute;mso-position-vertical-relative:line;mso-left-percent:-10001;mso-top-percent:-10001;v-text-anchor:top" o:gfxdata="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" filled="f">
                 <v:textbox>
                   <w:txbxContent>
                     <w:p>
@@ -1395,7 +1391,28 @@
       <w:pPr>
         <w:pStyle w:val="Code"/>
       </w:pPr>
-      <w:r>
+    </w:p>
+    <w:p>
+      <w:pPr>
+        <w:pStyle w:val="Code"/>
+      </w:pPr>
+    </w:p>
+    <w:p>
+      <w:pPr>
+        <w:pStyle w:val="Code"/>
+      </w:pPr>
+    </w:p>
+    <w:p>
+      <w:pPr>
+        <w:pStyle w:val="Code"/>
+      </w:pPr>
+    </w:p>
+    <w:p>
+      <w:pPr>
+        <w:pStyle w:val="Code"/>
+      </w:pPr>
+      <w:r>
+        <w:lastRenderedPageBreak/>
         <w:t>Listing 3</w:t>
       </w:r>
       <w:r>
@@ -1410,7 +1427,6 @@
         <w:rPr>
           <w:noProof/>
         </w:rPr>
-        <w:lastRenderedPageBreak/>
         <mc:AlternateContent>
           <mc:Choice Requires="wps">
             <w:drawing>
@@ -2120,6 +2136,11 @@
       <w:pPr>
         <w:pStyle w:val="Code"/>
       </w:pPr>
+    </w:p>
+    <w:p>
+      <w:pPr>
+        <w:pStyle w:val="Code"/>
+      </w:pPr>
       <w:r>
         <w:t>Listing</w:t>
       </w:r>
@@ -2153,9 +2174,9 @@
         <mc:AlternateContent>
           <mc:Choice Requires="wps">
             <w:drawing>
-              <wp:inline distT="0" distB="0" distL="0" distR="0" wp14:anchorId="079624EF" wp14:editId="4D93F544">
-                <wp:extent cx="3072130" cy="1941830"/>
-                <wp:effectExtent l="0" t="0" r="13970" b="20320"/>
+              <wp:inline distT="0" distB="0" distL="0" distR="0" wp14:anchorId="079624EF" wp14:editId="1045E007">
+                <wp:extent cx="3072130" cy="1607820"/>
+                <wp:effectExtent l="0" t="0" r="13970" b="11430"/>
                 <wp:docPr id="2001366649" name="Text Box 14"/>
                 <wp:cNvGraphicFramePr>
                   <a:graphicFrameLocks xmlns:a="http://schemas.openxmlformats.org/drawingml/2006/main"/>
@@ -2169,7 +2190,7 @@
                       <wps:spPr bwMode="auto">
                         <a:xfrm>
                           <a:off x="0" y="0"/>
-                          <a:ext cx="3072130" cy="1941830"/>
+                          <a:ext cx="3072130" cy="1607820"/>
                         </a:xfrm>
                         <a:prstGeom prst="rect">
                           <a:avLst/>
@@ -2221,7 +2242,7 @@
                               <w:jc w:val="left"/>
                             </w:pPr>
                             <w:r>
-                              <w:t xml:space="preserve">        {</w:t>
+                              <w:t xml:space="preserve">        { ....  </w:t>
                             </w:r>
                           </w:p>
                           <w:p>
@@ -2229,7 +2250,15 @@
                               <w:jc w:val="left"/>
                             </w:pPr>
                             <w:r>
-                              <w:t xml:space="preserve">         ....  </w:t>
+                              <w:t xml:space="preserve">          return </w:t>
+                            </w:r>
+                            <w:proofErr w:type="spellStart"/>
+                            <w:r>
+                              <w:t>folderSequences</w:t>
+                            </w:r>
+                            <w:proofErr w:type="spellEnd"/>
+                            <w:r>
+                              <w:t>;</w:t>
                             </w:r>
                           </w:p>
                           <w:p>
@@ -2237,15 +2266,7 @@
                               <w:jc w:val="left"/>
                             </w:pPr>
                             <w:r>
-                              <w:t xml:space="preserve">          return </w:t>
-                            </w:r>
-                            <w:proofErr w:type="spellStart"/>
-                            <w:r>
-                              <w:t>folderSequences</w:t>
-                            </w:r>
-                            <w:proofErr w:type="spellEnd"/>
-                            <w:r>
-                              <w:t>;</w:t>
+                              <w:t xml:space="preserve">        }</w:t>
                             </w:r>
                           </w:p>
                           <w:p>
@@ -2253,49 +2274,28 @@
                               <w:jc w:val="left"/>
                             </w:pPr>
                             <w:r>
-                              <w:t xml:space="preserve">        }</w:t>
+                              <w:t xml:space="preserve">public static List&lt;List&lt;double&gt;&gt; </w:t>
+                            </w:r>
+                            <w:proofErr w:type="spellStart"/>
+                            <w:proofErr w:type="gramStart"/>
+                            <w:r>
+                              <w:t>TrimSequences</w:t>
+                            </w:r>
+                            <w:proofErr w:type="spellEnd"/>
+                            <w:r>
+                              <w:t>(</w:t>
+                            </w:r>
+                            <w:proofErr w:type="gramEnd"/>
+                            <w:r>
+                              <w:t>List&lt;List&lt;double&gt;&gt; sequences)</w:t>
                             </w:r>
                           </w:p>
                           <w:p>
                             <w:pPr>
                               <w:jc w:val="left"/>
                             </w:pPr>
-                          </w:p>
-                          <w:p>
-                            <w:pPr>
-                              <w:jc w:val="left"/>
-                            </w:pPr>
-                            <w:r>
-                              <w:t xml:space="preserve">public static List&lt;List&lt;double&gt;&gt; </w:t>
-                            </w:r>
-                            <w:proofErr w:type="spellStart"/>
-                            <w:proofErr w:type="gramStart"/>
-                            <w:r>
-                              <w:t>TrimSequences</w:t>
-                            </w:r>
-                            <w:proofErr w:type="spellEnd"/>
-                            <w:r>
-                              <w:t>(</w:t>
-                            </w:r>
-                            <w:proofErr w:type="gramEnd"/>
-                            <w:r>
-                              <w:t>List&lt;List&lt;double&gt;&gt; sequences)</w:t>
-                            </w:r>
-                          </w:p>
-                          <w:p>
-                            <w:pPr>
-                              <w:jc w:val="left"/>
-                            </w:pPr>
-                            <w:r>
-                              <w:t xml:space="preserve">        {</w:t>
-                            </w:r>
-                          </w:p>
-                          <w:p>
-                            <w:pPr>
-                              <w:jc w:val="left"/>
-                            </w:pPr>
-                            <w:r>
-                              <w:t xml:space="preserve">        ....</w:t>
+                            <w:r>
+                              <w:t xml:space="preserve">        {....</w:t>
                             </w:r>
                           </w:p>
                           <w:p>
@@ -2344,7 +2344,7 @@
           </mc:Choice>
           <mc:Fallback>
             <w:pict>
-              <v:shape w14:anchorId="079624EF" id="Text Box 14" o:spid="_x0000_s1029" type="#_x0000_t202" style="width:241.9pt;height:152.9pt;visibility:visible;mso-wrap-style:square;mso-left-percent:-10001;mso-top-percent:-10001;mso-position-horizontal:absolute;mso-position-horizontal-relative:char;mso-position-vertical:absolute;mso-position-vertical-relative:line;mso-left-percent:-10001;mso-top-percent:-10001;v-text-anchor:top" o:gfxdata="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" filled="f">
+              <v:shape w14:anchorId="079624EF" id="Text Box 14" o:spid="_x0000_s1029" type="#_x0000_t202" style="width:241.9pt;height:126.6pt;visibility:visible;mso-wrap-style:square;mso-left-percent:-10001;mso-top-percent:-10001;mso-position-horizontal:absolute;mso-position-horizontal-relative:char;mso-position-vertical:absolute;mso-position-vertical-relative:line;mso-left-percent:-10001;mso-top-percent:-10001;v-text-anchor:top" o:gfxdata="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" filled="f">
                 <v:textbox>
                   <w:txbxContent>
                     <w:p>
@@ -2373,7 +2373,7 @@
                         <w:jc w:val="left"/>
                       </w:pPr>
                       <w:r>
-                        <w:t xml:space="preserve">        {</w:t>
+                        <w:t xml:space="preserve">        { ....  </w:t>
                       </w:r>
                     </w:p>
                     <w:p>
@@ -2381,7 +2381,15 @@
                         <w:jc w:val="left"/>
                       </w:pPr>
                       <w:r>
-                        <w:t xml:space="preserve">         ....  </w:t>
+                        <w:t xml:space="preserve">          return </w:t>
+                      </w:r>
+                      <w:proofErr w:type="spellStart"/>
+                      <w:r>
+                        <w:t>folderSequences</w:t>
+                      </w:r>
+                      <w:proofErr w:type="spellEnd"/>
+                      <w:r>
+                        <w:t>;</w:t>
                       </w:r>
                     </w:p>
                     <w:p>
@@ -2389,15 +2397,7 @@
                         <w:jc w:val="left"/>
                       </w:pPr>
                       <w:r>
-                        <w:t xml:space="preserve">          return </w:t>
-                      </w:r>
-                      <w:proofErr w:type="spellStart"/>
-                      <w:r>
-                        <w:t>folderSequences</w:t>
-                      </w:r>
-                      <w:proofErr w:type="spellEnd"/>
-                      <w:r>
-                        <w:t>;</w:t>
+                        <w:t xml:space="preserve">        }</w:t>
                       </w:r>
                     </w:p>
                     <w:p>
@@ -2405,49 +2405,28 @@
                         <w:jc w:val="left"/>
                       </w:pPr>
                       <w:r>
-                        <w:t xml:space="preserve">        }</w:t>
+                        <w:t xml:space="preserve">public static List&lt;List&lt;double&gt;&gt; </w:t>
+                      </w:r>
+                      <w:proofErr w:type="spellStart"/>
+                      <w:proofErr w:type="gramStart"/>
+                      <w:r>
+                        <w:t>TrimSequences</w:t>
+                      </w:r>
+                      <w:proofErr w:type="spellEnd"/>
+                      <w:r>
+                        <w:t>(</w:t>
+                      </w:r>
+                      <w:proofErr w:type="gramEnd"/>
+                      <w:r>
+                        <w:t>List&lt;List&lt;double&gt;&gt; sequences)</w:t>
                       </w:r>
                     </w:p>
                     <w:p>
                       <w:pPr>
                         <w:jc w:val="left"/>
                       </w:pPr>
-                    </w:p>
-                    <w:p>
-                      <w:pPr>
-                        <w:jc w:val="left"/>
-                      </w:pPr>
-                      <w:r>
-                        <w:t xml:space="preserve">public static List&lt;List&lt;double&gt;&gt; </w:t>
-                      </w:r>
-                      <w:proofErr w:type="spellStart"/>
-                      <w:proofErr w:type="gramStart"/>
-                      <w:r>
-                        <w:t>TrimSequences</w:t>
-                      </w:r>
-                      <w:proofErr w:type="spellEnd"/>
-                      <w:r>
-                        <w:t>(</w:t>
-                      </w:r>
-                      <w:proofErr w:type="gramEnd"/>
-                      <w:r>
-                        <w:t>List&lt;List&lt;double&gt;&gt; sequences)</w:t>
-                      </w:r>
-                    </w:p>
-                    <w:p>
-                      <w:pPr>
-                        <w:jc w:val="left"/>
-                      </w:pPr>
-                      <w:r>
-                        <w:t xml:space="preserve">        {</w:t>
-                      </w:r>
-                    </w:p>
-                    <w:p>
-                      <w:pPr>
-                        <w:jc w:val="left"/>
-                      </w:pPr>
-                      <w:r>
-                        <w:t xml:space="preserve">        ....</w:t>
+                      <w:r>
+                        <w:t xml:space="preserve">        {....</w:t>
                       </w:r>
                     </w:p>
                     <w:p>
@@ -2663,15 +2642,9 @@
                               <w:rPr>
                                 <w:lang w:val="en-GB"/>
                               </w:rPr>
-                              <w:t>&gt;(</w:t>
+                              <w:t>&gt;();</w:t>
                             </w:r>
                             <w:proofErr w:type="gramEnd"/>
-                            <w:r>
-                              <w:rPr>
-                                <w:lang w:val="en-GB"/>
-                              </w:rPr>
-                              <w:t>);</w:t>
-                            </w:r>
                           </w:p>
                           <w:p>
                             <w:pPr>
@@ -2856,8 +2829,16 @@
                               <w:rPr>
                                 <w:lang w:val="en-GB"/>
                               </w:rPr>
-                              <w:t>(key, value);</w:t>
-                            </w:r>
+                              <w:t>(key, value</w:t>
+                            </w:r>
+                            <w:proofErr w:type="gramStart"/>
+                            <w:r>
+                              <w:rPr>
+                                <w:lang w:val="en-GB"/>
+                              </w:rPr>
+                              <w:t>);</w:t>
+                            </w:r>
+                            <w:proofErr w:type="gramEnd"/>
                           </w:p>
                           <w:p>
                             <w:pPr>
@@ -3309,12 +3290,9 @@
                             </w:r>
                             <w:proofErr w:type="spellEnd"/>
                             <w:r>
-                              <w:t>(</w:t>
+                              <w:t>();</w:t>
                             </w:r>
                             <w:proofErr w:type="gramEnd"/>
-                            <w:r>
-                              <w:t>);</w:t>
-                            </w:r>
                           </w:p>
                           <w:p>
                             <w:pPr>
@@ -3338,9 +3316,11 @@
                               <w:t>htmInput</w:t>
                             </w:r>
                             <w:proofErr w:type="spellEnd"/>
+                            <w:proofErr w:type="gramStart"/>
                             <w:r>
                               <w:t>);</w:t>
                             </w:r>
+                            <w:proofErr w:type="gramEnd"/>
                           </w:p>
                           <w:p>
                             <w:pPr>
@@ -3544,39 +3524,37 @@
         <w:spacing w:line="256" w:lineRule="auto"/>
         <w:jc w:val="both"/>
       </w:pPr>
+      <w:r>
+        <w:t>In the end, we use the </w:t>
+      </w:r>
       <w:proofErr w:type="spellStart"/>
       <w:r>
-        <w:t>A</w:t>
-      </w:r>
-      <w:r>
-        <w:t>In</w:t>
+        <w:fldChar w:fldCharType="begin"/>
+      </w:r>
+      <w:r>
+        <w:instrText>HYPERLINK "https://github.com/almahamud1234/neocortexapi/blob/MatrixMasters/source/MySEProject/AnomalyDetectionSample/HTMAnomalyExperiment.cs"</w:instrText>
+      </w:r>
+      <w:r>
+        <w:fldChar w:fldCharType="separate"/>
+      </w:r>
+      <w:r>
+        <w:rPr>
+          <w:rStyle w:val="Hyperlink"/>
+        </w:rPr>
+        <w:t>HTMAnomalyExperiment</w:t>
       </w:r>
       <w:proofErr w:type="spellEnd"/>
       <w:r>
-        <w:t xml:space="preserve"> the end, we use the </w:t>
-      </w:r>
-      <w:proofErr w:type="spellStart"/>
-      <w:r>
-        <w:fldChar w:fldCharType="begin"/>
-      </w:r>
-      <w:r>
-        <w:instrText>HYPERLINK "https://github.com/almahamud1234/neocortexapi/blob/MatrixMasters/source/MySEProject/AnomalyDetectionSample/HTMAnomalyExperiment.cs"</w:instrText>
-      </w:r>
-      <w:r>
-        <w:fldChar w:fldCharType="separate"/>
-      </w:r>
-      <w:r>
-        <w:rPr>
-          <w:rStyle w:val="Hyperlink"/>
-        </w:rPr>
-        <w:t>HTMAnomalyExperiment</w:t>
-      </w:r>
-      <w:proofErr w:type="spellEnd"/>
-      <w:r>
         <w:fldChar w:fldCharType="end"/>
       </w:r>
       <w:r>
-        <w:t> class to detect anomalies in sequences read from files inside the predicting folder. All the previously explained classes—CSV file reading (using </w:t>
+        <w:t> class to detect anomalies in sequences read from files inside the predicting folder. All the previously explained classes</w:t>
+      </w:r>
+      <w:r>
+        <w:t xml:space="preserve"> - </w:t>
+      </w:r>
+      <w:r>
+        <w:t>CSV file reading (using </w:t>
       </w:r>
       <w:proofErr w:type="spellStart"/>
       <w:r>
@@ -3667,17 +3645,23 @@
       <w:pPr>
         <w:pStyle w:val="Code"/>
       </w:pPr>
-      <w:r>
+    </w:p>
+    <w:p>
+      <w:pPr>
+        <w:pStyle w:val="Code"/>
+      </w:pPr>
+    </w:p>
+    <w:p>
+      <w:pPr>
+        <w:pStyle w:val="Code"/>
+      </w:pPr>
+      <w:r>
+        <w:lastRenderedPageBreak/>
         <w:t xml:space="preserve">Listing 7 </w:t>
       </w:r>
       <w:r>
         <w:t>Collecting Testing Data and Anomaly Detection</w:t>
       </w:r>
-    </w:p>
-    <w:p>
-      <w:pPr>
-        <w:pStyle w:val="Code"/>
-      </w:pPr>
     </w:p>
     <w:p>
       <w:pPr>
@@ -3688,13 +3672,12 @@
         <w:rPr>
           <w:noProof/>
         </w:rPr>
-        <w:lastRenderedPageBreak/>
         <mc:AlternateContent>
           <mc:Choice Requires="wps">
             <w:drawing>
-              <wp:inline distT="0" distB="0" distL="0" distR="0" wp14:anchorId="33D7AE45" wp14:editId="61CD8654">
-                <wp:extent cx="3133725" cy="1384935"/>
-                <wp:effectExtent l="7620" t="5715" r="11430" b="9525"/>
+              <wp:inline distT="0" distB="0" distL="0" distR="0" wp14:anchorId="33D7AE45" wp14:editId="636FBE04">
+                <wp:extent cx="3133725" cy="1259205"/>
+                <wp:effectExtent l="0" t="0" r="28575" b="17145"/>
                 <wp:docPr id="1302574687" name="Text Box 11"/>
                 <wp:cNvGraphicFramePr>
                   <a:graphicFrameLocks xmlns:a="http://schemas.openxmlformats.org/drawingml/2006/main"/>
@@ -3708,7 +3691,7 @@
                       <wps:spPr bwMode="auto">
                         <a:xfrm>
                           <a:off x="0" y="0"/>
-                          <a:ext cx="3133725" cy="1384935"/>
+                          <a:ext cx="3133725" cy="1259205"/>
                         </a:xfrm>
                         <a:prstGeom prst="rect">
                           <a:avLst/>
@@ -3762,8 +3745,13 @@
                             <w:proofErr w:type="spellEnd"/>
                             <w:proofErr w:type="gramEnd"/>
                             <w:r>
-                              <w:t>());</w:t>
-                            </w:r>
+                              <w:t>()</w:t>
+                            </w:r>
+                            <w:proofErr w:type="gramStart"/>
+                            <w:r>
+                              <w:t>);</w:t>
+                            </w:r>
+                            <w:proofErr w:type="gramEnd"/>
                           </w:p>
                           <w:p>
                             <w:pPr>
@@ -3793,8 +3781,13 @@
                             <w:proofErr w:type="spellEnd"/>
                             <w:proofErr w:type="gramEnd"/>
                             <w:r>
-                              <w:t>(), _tolerance);</w:t>
-                            </w:r>
+                              <w:t>(), _tolerance</w:t>
+                            </w:r>
+                            <w:proofErr w:type="gramStart"/>
+                            <w:r>
+                              <w:t>);</w:t>
+                            </w:r>
+                            <w:proofErr w:type="gramEnd"/>
                           </w:p>
                           <w:p>
                             <w:pPr>
@@ -3843,7 +3836,7 @@
           </mc:Choice>
           <mc:Fallback>
             <w:pict>
-              <v:shape w14:anchorId="33D7AE45" id="Text Box 11" o:spid="_x0000_s1032" type="#_x0000_t202" style="width:246.75pt;height:109.05pt;visibility:visible;mso-wrap-style:square;mso-left-percent:-10001;mso-top-percent:-10001;mso-position-horizontal:absolute;mso-position-horizontal-relative:char;mso-position-vertical:absolute;mso-position-vertical-relative:line;mso-left-percent:-10001;mso-top-percent:-10001;v-text-anchor:top" o:gfxdata="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" filled="f">
+              <v:shape w14:anchorId="33D7AE45" id="Text Box 11" o:spid="_x0000_s1032" type="#_x0000_t202" style="width:246.75pt;height:99.15pt;visibility:visible;mso-wrap-style:square;mso-left-percent:-10001;mso-top-percent:-10001;mso-position-horizontal:absolute;mso-position-horizontal-relative:char;mso-position-vertical:absolute;mso-position-vertical-relative:line;mso-left-percent:-10001;mso-top-percent:-10001;v-text-anchor:top" o:gfxdata="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" filled="f">
                 <v:textbox>
                   <w:txbxContent>
                     <w:p>
@@ -3874,8 +3867,13 @@
                       <w:proofErr w:type="spellEnd"/>
                       <w:proofErr w:type="gramEnd"/>
                       <w:r>
-                        <w:t>());</w:t>
-                      </w:r>
+                        <w:t>()</w:t>
+                      </w:r>
+                      <w:proofErr w:type="gramStart"/>
+                      <w:r>
+                        <w:t>);</w:t>
+                      </w:r>
+                      <w:proofErr w:type="gramEnd"/>
                     </w:p>
                     <w:p>
                       <w:pPr>
@@ -3905,8 +3903,13 @@
                       <w:proofErr w:type="spellEnd"/>
                       <w:proofErr w:type="gramEnd"/>
                       <w:r>
-                        <w:t>(), _tolerance);</w:t>
-                      </w:r>
+                        <w:t>(), _tolerance</w:t>
+                      </w:r>
+                      <w:proofErr w:type="gramStart"/>
+                      <w:r>
+                        <w:t>);</w:t>
+                      </w:r>
+                      <w:proofErr w:type="gramEnd"/>
                     </w:p>
                     <w:p>
                       <w:pPr>
@@ -4299,17 +4302,17 @@
       <w:pPr>
         <w:pStyle w:val="Code"/>
       </w:pPr>
-      <w:r>
-        <w:t xml:space="preserve">Listing 9 </w:t>
+      <w:proofErr w:type="gramStart"/>
+      <w:r>
+        <w:t>Listing</w:t>
+      </w:r>
+      <w:proofErr w:type="gramEnd"/>
+      <w:r>
+        <w:t xml:space="preserve"> 9 </w:t>
       </w:r>
       <w:r>
         <w:t>Applying Anomaly Detection to Test Data</w:t>
       </w:r>
-    </w:p>
-    <w:p>
-      <w:pPr>
-        <w:pStyle w:val="Code"/>
-      </w:pPr>
     </w:p>
     <w:p>
       <w:pPr>
@@ -4323,9 +4326,9 @@
         <mc:AlternateContent>
           <mc:Choice Requires="wps">
             <w:drawing>
-              <wp:inline distT="0" distB="0" distL="0" distR="0" wp14:anchorId="76079094" wp14:editId="44CF55B9">
-                <wp:extent cx="2904490" cy="1132205"/>
-                <wp:effectExtent l="5715" t="8255" r="13970" b="12065"/>
+              <wp:inline distT="0" distB="0" distL="0" distR="0" wp14:anchorId="76079094" wp14:editId="46B11D09">
+                <wp:extent cx="2904490" cy="1020445"/>
+                <wp:effectExtent l="0" t="0" r="10160" b="27305"/>
                 <wp:docPr id="78650293" name="Text Box 9"/>
                 <wp:cNvGraphicFramePr>
                   <a:graphicFrameLocks xmlns:a="http://schemas.openxmlformats.org/drawingml/2006/main"/>
@@ -4339,7 +4342,7 @@
                       <wps:spPr bwMode="auto">
                         <a:xfrm>
                           <a:off x="0" y="0"/>
-                          <a:ext cx="2904490" cy="1132205"/>
+                          <a:ext cx="2904490" cy="1020445"/>
                         </a:xfrm>
                         <a:prstGeom prst="rect">
                           <a:avLst/>
@@ -4428,8 +4431,13 @@
                             <w:proofErr w:type="spellEnd"/>
                             <w:proofErr w:type="gramEnd"/>
                             <w:r>
-                              <w:t>();</w:t>
-                            </w:r>
+                              <w:t>(</w:t>
+                            </w:r>
+                            <w:proofErr w:type="gramStart"/>
+                            <w:r>
+                              <w:t>);</w:t>
+                            </w:r>
+                            <w:proofErr w:type="gramEnd"/>
                           </w:p>
                           <w:p>
                             <w:pPr>
@@ -4461,9 +4469,11 @@
                               <w:t>lst</w:t>
                             </w:r>
                             <w:proofErr w:type="spellEnd"/>
+                            <w:proofErr w:type="gramStart"/>
                             <w:r>
                               <w:t>);</w:t>
                             </w:r>
+                            <w:proofErr w:type="gramEnd"/>
                           </w:p>
                           <w:p>
                             <w:pPr>
@@ -4486,7 +4496,7 @@
           </mc:Choice>
           <mc:Fallback>
             <w:pict>
-              <v:shape w14:anchorId="76079094" id="Text Box 9" o:spid="_x0000_s1034" type="#_x0000_t202" style="width:228.7pt;height:89.15pt;visibility:visible;mso-wrap-style:square;mso-left-percent:-10001;mso-top-percent:-10001;mso-position-horizontal:absolute;mso-position-horizontal-relative:char;mso-position-vertical:absolute;mso-position-vertical-relative:line;mso-left-percent:-10001;mso-top-percent:-10001;v-text-anchor:top" o:gfxdata="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" filled="f">
+              <v:shape w14:anchorId="76079094" id="Text Box 9" o:spid="_x0000_s1034" type="#_x0000_t202" style="width:228.7pt;height:80.35pt;visibility:visible;mso-wrap-style:square;mso-left-percent:-10001;mso-top-percent:-10001;mso-position-horizontal:absolute;mso-position-horizontal-relative:char;mso-position-vertical:absolute;mso-position-vertical-relative:line;mso-left-percent:-10001;mso-top-percent:-10001;v-text-anchor:top" o:gfxdata="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" filled="f">
                 <v:textbox>
                   <w:txbxContent>
                     <w:p>
@@ -4552,8 +4562,13 @@
                       <w:proofErr w:type="spellEnd"/>
                       <w:proofErr w:type="gramEnd"/>
                       <w:r>
-                        <w:t>();</w:t>
-                      </w:r>
+                        <w:t>(</w:t>
+                      </w:r>
+                      <w:proofErr w:type="gramStart"/>
+                      <w:r>
+                        <w:t>);</w:t>
+                      </w:r>
+                      <w:proofErr w:type="gramEnd"/>
                     </w:p>
                     <w:p>
                       <w:pPr>
@@ -4585,9 +4600,11 @@
                         <w:t>lst</w:t>
                       </w:r>
                       <w:proofErr w:type="spellEnd"/>
+                      <w:proofErr w:type="gramStart"/>
                       <w:r>
                         <w:t>);</w:t>
                       </w:r>
+                      <w:proofErr w:type="gramEnd"/>
                     </w:p>
                     <w:p>
                       <w:pPr>
@@ -4765,12 +4782,6 @@
       <w:r>
         <w:t>.</w:t>
       </w:r>
-    </w:p>
-    <w:p>
-      <w:pPr>
-        <w:spacing w:line="256" w:lineRule="auto"/>
-        <w:jc w:val="both"/>
-      </w:pPr>
     </w:p>
     <w:p>
       <w:pPr>
@@ -4858,8 +4869,13 @@
                             <w:proofErr w:type="spellEnd"/>
                             <w:proofErr w:type="gramEnd"/>
                             <w:r>
-                              <w:t>(item);</w:t>
-                            </w:r>
+                              <w:t>(item</w:t>
+                            </w:r>
+                            <w:proofErr w:type="gramStart"/>
+                            <w:r>
+                              <w:t>);</w:t>
+                            </w:r>
+                            <w:proofErr w:type="gramEnd"/>
                           </w:p>
                         </w:txbxContent>
                       </wps:txbx>
@@ -5176,9 +5192,9 @@
         <mc:AlternateContent>
           <mc:Choice Requires="wps">
             <w:drawing>
-              <wp:inline distT="0" distB="0" distL="0" distR="0" wp14:anchorId="67C9F158" wp14:editId="65F426F8">
-                <wp:extent cx="2942590" cy="3399155"/>
-                <wp:effectExtent l="10795" t="12700" r="8890" b="7620"/>
+              <wp:inline distT="0" distB="0" distL="0" distR="0" wp14:anchorId="67C9F158" wp14:editId="4DE5A1A4">
+                <wp:extent cx="2942590" cy="4658360"/>
+                <wp:effectExtent l="0" t="0" r="10160" b="27940"/>
                 <wp:docPr id="1392898039" name="Text Box 6"/>
                 <wp:cNvGraphicFramePr>
                   <a:graphicFrameLocks xmlns:a="http://schemas.openxmlformats.org/drawingml/2006/main"/>
@@ -5192,7 +5208,7 @@
                       <wps:spPr bwMode="auto">
                         <a:xfrm>
                           <a:off x="0" y="0"/>
-                          <a:ext cx="2942590" cy="3399155"/>
+                          <a:ext cx="2942590" cy="4658360"/>
                         </a:xfrm>
                         <a:prstGeom prst="rect">
                           <a:avLst/>
@@ -5265,15 +5281,7 @@
                             </w:r>
                             <w:proofErr w:type="spellEnd"/>
                             <w:r>
-                              <w:t xml:space="preserve"> = </w:t>
-                            </w:r>
-                            <w:proofErr w:type="spellStart"/>
-                            <w:r>
-                              <w:t>i</w:t>
-                            </w:r>
-                            <w:proofErr w:type="spellEnd"/>
-                            <w:r>
-                              <w:t xml:space="preserve"> + 1;</w:t>
+                              <w:t xml:space="preserve"> = i + 1;</w:t>
                             </w:r>
                           </w:p>
                           <w:p>
@@ -5323,8 +5331,13 @@
                             <w:proofErr w:type="spellEnd"/>
                             <w:proofErr w:type="gramEnd"/>
                             <w:r>
-                              <w:t>(tokens2.Last());</w:t>
-                            </w:r>
+                              <w:t>(tokens2.Last()</w:t>
+                            </w:r>
+                            <w:proofErr w:type="gramStart"/>
+                            <w:r>
+                              <w:t>);</w:t>
+                            </w:r>
+                            <w:proofErr w:type="gramEnd"/>
                           </w:p>
                           <w:p>
                             <w:pPr>
@@ -5605,7 +5618,7 @@
           </mc:Choice>
           <mc:Fallback>
             <w:pict>
-              <v:shape w14:anchorId="67C9F158" id="Text Box 6" o:spid="_x0000_s1037" type="#_x0000_t202" style="width:231.7pt;height:267.65pt;visibility:visible;mso-wrap-style:square;mso-left-percent:-10001;mso-top-percent:-10001;mso-position-horizontal:absolute;mso-position-horizontal-relative:char;mso-position-vertical:absolute;mso-position-vertical-relative:line;mso-left-percent:-10001;mso-top-percent:-10001;v-text-anchor:top" o:gfxdata="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" filled="f">
+              <v:shape w14:anchorId="67C9F158" id="Text Box 6" o:spid="_x0000_s1037" type="#_x0000_t202" style="width:231.7pt;height:366.8pt;visibility:visible;mso-wrap-style:square;mso-left-percent:-10001;mso-top-percent:-10001;mso-position-horizontal:absolute;mso-position-horizontal-relative:char;mso-position-vertical:absolute;mso-position-vertical-relative:line;mso-left-percent:-10001;mso-top-percent:-10001;v-text-anchor:top" o:gfxdata="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" filled="f">
                 <v:textbox>
                   <w:txbxContent>
                     <w:p>
@@ -5655,15 +5668,7 @@
                       </w:r>
                       <w:proofErr w:type="spellEnd"/>
                       <w:r>
-                        <w:t xml:space="preserve"> = </w:t>
-                      </w:r>
-                      <w:proofErr w:type="spellStart"/>
-                      <w:r>
-                        <w:t>i</w:t>
-                      </w:r>
-                      <w:proofErr w:type="spellEnd"/>
-                      <w:r>
-                        <w:t xml:space="preserve"> + 1;</w:t>
+                        <w:t xml:space="preserve"> = i + 1;</w:t>
                       </w:r>
                     </w:p>
                     <w:p>
@@ -5713,8 +5718,13 @@
                       <w:proofErr w:type="spellEnd"/>
                       <w:proofErr w:type="gramEnd"/>
                       <w:r>
-                        <w:t>(tokens2.Last());</w:t>
-                      </w:r>
+                        <w:t>(tokens2.Last()</w:t>
+                      </w:r>
+                      <w:proofErr w:type="gramStart"/>
+                      <w:r>
+                        <w:t>);</w:t>
+                      </w:r>
+                      <w:proofErr w:type="gramEnd"/>
                     </w:p>
                     <w:p>
                       <w:pPr>
@@ -6169,7 +6179,6 @@
         <w:pStyle w:val="Code"/>
       </w:pPr>
       <w:r>
-        <w:lastRenderedPageBreak/>
         <w:t>Listing 1</w:t>
       </w:r>
       <w:r>
@@ -6357,7 +6366,7 @@
       <w:r>
         <w:t> </w:t>
       </w:r>
-      <w:hyperlink r:id="rId11" w:history="1">
+      <w:hyperlink r:id="rId13" w:history="1">
         <w:r>
           <w:rPr>
             <w:rStyle w:val="Hyperlink"/>
@@ -6427,9 +6436,9 @@
         <mc:AlternateContent>
           <mc:Choice Requires="wps">
             <w:drawing>
-              <wp:inline distT="0" distB="0" distL="0" distR="0" wp14:anchorId="49D26823" wp14:editId="5D5F90D5">
-                <wp:extent cx="3056890" cy="1428750"/>
-                <wp:effectExtent l="9525" t="10795" r="10160" b="8255"/>
+              <wp:inline distT="0" distB="0" distL="0" distR="0" wp14:anchorId="49D26823" wp14:editId="3E9B1354">
+                <wp:extent cx="3056890" cy="1330325"/>
+                <wp:effectExtent l="0" t="0" r="10160" b="22225"/>
                 <wp:docPr id="477144136" name="Text Box 4"/>
                 <wp:cNvGraphicFramePr>
                   <a:graphicFrameLocks xmlns:a="http://schemas.openxmlformats.org/drawingml/2006/main"/>
@@ -6443,7 +6452,7 @@
                       <wps:spPr bwMode="auto">
                         <a:xfrm>
                           <a:off x="0" y="0"/>
-                          <a:ext cx="3056890" cy="1428750"/>
+                          <a:ext cx="3056890" cy="1330325"/>
                         </a:xfrm>
                         <a:prstGeom prst="rect">
                           <a:avLst/>
@@ -6617,7 +6626,7 @@
           </mc:Choice>
           <mc:Fallback>
             <w:pict>
-              <v:shape w14:anchorId="49D26823" id="Text Box 4" o:spid="_x0000_s1039" type="#_x0000_t202" style="width:240.7pt;height:112.5pt;visibility:visible;mso-wrap-style:square;mso-left-percent:-10001;mso-top-percent:-10001;mso-position-horizontal:absolute;mso-position-horizontal-relative:char;mso-position-vertical:absolute;mso-position-vertical-relative:line;mso-left-percent:-10001;mso-top-percent:-10001;v-text-anchor:top" o:gfxdata="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" filled="f">
+              <v:shape w14:anchorId="49D26823" id="Text Box 4" o:spid="_x0000_s1039" type="#_x0000_t202" style="width:240.7pt;height:104.75pt;visibility:visible;mso-wrap-style:square;mso-left-percent:-10001;mso-top-percent:-10001;mso-position-horizontal:absolute;mso-position-horizontal-relative:char;mso-position-vertical:absolute;mso-position-vertical-relative:line;mso-left-percent:-10001;mso-top-percent:-10001;v-text-anchor:top" o:gfxdata="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" filled="f">
                 <v:textbox>
                   <w:txbxContent>
                     <w:p>
@@ -6784,7 +6793,7 @@
       <w:r>
         <w:t xml:space="preserve"> the unit tests, we ensured the behavior of detection of anomalies in the project. Project files for the units test can be found </w:t>
       </w:r>
-      <w:hyperlink r:id="rId12" w:history="1">
+      <w:hyperlink r:id="rId14" w:history="1">
         <w:r>
           <w:rPr>
             <w:rStyle w:val="Hyperlink"/>
@@ -6818,7 +6827,7 @@
         </w:rPr>
         <w:t>Once the experiment concludes, the anomaly detection results persisted to the screen, along with HTM accuracy for each individual number sequences and overall HTM accuracy for the whole experiment. We have uploaded the anomaly results of our data in this repository for reference. output result of combined numerical sequence data from training folder (without anomalies) and predicting folder (with anomalies) can be found </w:t>
       </w:r>
-      <w:hyperlink r:id="rId13" w:history="1">
+      <w:hyperlink r:id="rId15" w:history="1">
         <w:r>
           <w:rPr>
             <w:rStyle w:val="Hyperlink"/>
@@ -6850,52 +6859,38 @@
           <w:b/>
           <w:bCs/>
         </w:rPr>
-        <w:t>U</w:t>
+        <w:t>Unit</w:t>
       </w:r>
       <w:r>
         <w:rPr>
           <w:b/>
           <w:bCs/>
         </w:rPr>
-        <w:t>nit</w:t>
+        <w:t xml:space="preserve"> </w:t>
       </w:r>
       <w:r>
         <w:rPr>
           <w:b/>
           <w:bCs/>
         </w:rPr>
+        <w:t>test:</w:t>
+      </w:r>
+      <w:r>
         <w:t xml:space="preserve"> </w:t>
       </w:r>
       <w:r>
-        <w:rPr>
-          <w:b/>
-          <w:bCs/>
-        </w:rPr>
-        <w:t>test</w:t>
-      </w:r>
-      <w:r>
-        <w:rPr>
-          <w:b/>
-          <w:bCs/>
-        </w:rPr>
-        <w:t>:</w:t>
+        <w:t>We have developed a unit tests project to thoroughly evaluate the functionality of the anomaly detection system. Unit tests are essential for confirming that individual functions and components of the system work as intended in isolation. The primary objective of these tests is to validate that the system behaves as expected across various scenarios, ensuring the accuracy and reliability of anomaly detection. During the implementation of the unit tests, we focused on verifying the system's ability to correctly identify anomalies within given data sequences.</w:t>
       </w:r>
       <w:r>
         <w:t xml:space="preserve"> </w:t>
       </w:r>
       <w:r>
-        <w:t>We have developed a unit tests project to thoroughly evaluate the functionality of the anomaly detection system. Unit tests are essential for confirming that individual functions and components of the system work as intended in isolation. The primary objective of these tests is to validate that the system behaves as expected across various scenarios, ensuring the accuracy and reliability of anomaly detection. During the implementation of the unit tests, we focused on verifying the system's ability to correctly identify anomalies within given data sequences.</w:t>
-      </w:r>
-      <w:r>
-        <w:t xml:space="preserve"> </w:t>
-      </w:r>
-      <w:r>
         <w:rPr>
           <w:lang w:val="en-US"/>
         </w:rPr>
         <w:t>Project files for the units test can be found </w:t>
       </w:r>
-      <w:hyperlink r:id="rId14" w:history="1">
+      <w:hyperlink r:id="rId16" w:history="1">
         <w:r>
           <w:rPr>
             <w:rStyle w:val="Hyperlink"/>
@@ -6925,37 +6920,10 @@
         <w:t xml:space="preserve"> </w:t>
       </w:r>
       <w:r>
-        <w:t>As part of the anomaly detection project, we incorporated a graphical representation of the training and prediction sequences, along with highlighted anomalies, to facilitate a better understanding of the model's performance. After successfully executing the anomaly detection process, the system generates plots in HTML format, which are displayed directly in the browser for immediate review. Additionally, these plots are saved in the output graph folder for future reference or analysis.</w:t>
-      </w:r>
-      <w:r>
-        <w:t xml:space="preserve"> </w:t>
-      </w:r>
-      <w:r>
-        <w:t>We created two types of plots to visualize the results:</w:t>
-      </w:r>
-      <w:r>
-        <w:t xml:space="preserve"> </w:t>
-      </w:r>
-      <w:r>
-        <w:t xml:space="preserve">Training vs. Prediction Plot: This plot compares the actual training data against the predicted values generated by the model. It helps in visually assessing the model's accuracy in predicting normal sequences and detecting </w:t>
-      </w:r>
-      <w:r>
-        <w:t>patterns. Anomaly</w:t>
-      </w:r>
-      <w:r>
-        <w:t xml:space="preserve"> Detection Plot: This plot highlights the anomalies detected during the prediction phase. </w:t>
-      </w:r>
-      <w:r>
-        <w:t>Any data point that deviates significantly from the predicted values is marked, making it easier to spot irregularities in the data.</w:t>
-      </w:r>
-      <w:r>
-        <w:t xml:space="preserve"> </w:t>
-      </w:r>
-      <w:r>
-        <w:t>By providing these visualizations, we can gain insights into how well the model performs in real-time anomaly detection and easily identify any areas where improvements may be needed.</w:t>
-      </w:r>
-      <w:r>
-        <w:t xml:space="preserve"> </w:t>
+        <w:t xml:space="preserve">As part of the anomaly detection project, we incorporated a graphical representation of the training and prediction sequences, along with highlighted anomalies, to facilitate a better understanding of the model's performance. After successfully executing the anomaly detection process, the system generates plots in HTML format, which are displayed directly in the browser for immediate review. Additionally, these plots are saved in the output graph folder for future reference or analysis. We created two types of plots to visualize the results: Training vs. Prediction Plot: This plot compares the actual training data against the predicted values </w:t>
+      </w:r>
+      <w:r>
+        <w:t xml:space="preserve">generated by the model. It helps in visually assessing the model's accuracy in predicting normal sequences and detecting patterns. Anomaly Detection Plot: This plot highlights the anomalies detected during the prediction phase. Any data point that deviates significantly from the predicted values is marked, making it easier to spot irregularities in the data. By providing these visualizations, we can gain insights into how well the model performs in real-time anomaly detection and easily identify any areas where improvements may be needed. </w:t>
       </w:r>
       <w:r>
         <w:rPr>
@@ -6963,13 +6931,27 @@
         </w:rPr>
         <w:t>output graph </w:t>
       </w:r>
-      <w:hyperlink r:id="rId15" w:history="1">
+      <w:hyperlink r:id="rId17" w:history="1">
         <w:r>
           <w:rPr>
             <w:rStyle w:val="Hyperlink"/>
             <w:lang w:val="en-US"/>
           </w:rPr>
-          <w:t>folder</w:t>
+          <w:t>fol</w:t>
+        </w:r>
+        <w:r>
+          <w:rPr>
+            <w:rStyle w:val="Hyperlink"/>
+            <w:lang w:val="en-US"/>
+          </w:rPr>
+          <w:t>d</w:t>
+        </w:r>
+        <w:r>
+          <w:rPr>
+            <w:rStyle w:val="Hyperlink"/>
+            <w:lang w:val="en-US"/>
+          </w:rPr>
+          <w:t>er</w:t>
         </w:r>
       </w:hyperlink>
       <w:r>
@@ -7010,6 +6992,12 @@
           <w:lang w:val="en-US"/>
         </w:rPr>
         <w:t xml:space="preserve"> sequence plot</w:t>
+      </w:r>
+      <w:r>
+        <w:rPr>
+          <w:lang w:val="en-US"/>
+        </w:rPr>
+        <w:t xml:space="preserve"> </w:t>
       </w:r>
     </w:p>
     <w:p>
@@ -7049,7 +7037,7 @@
                     </pic:cNvPicPr>
                   </pic:nvPicPr>
                   <pic:blipFill>
-                    <a:blip r:embed="rId16" cstate="print">
+                    <a:blip r:embed="rId18" cstate="print">
                       <a:extLst>
                         <a:ext uri="{28A0092B-C50C-407E-A947-70E740481C1C}">
                           <a14:useLocalDpi xmlns:a14="http://schemas.microsoft.com/office/drawing/2010/main" val="0"/>
@@ -7116,9 +7104,14 @@
         </w:rPr>
         <w:t xml:space="preserve">: </w:t>
       </w:r>
-      <w:r>
-        <w:t>Comparison of Actual vs. Predicted Sequences</w:t>
-      </w:r>
+      <w:hyperlink r:id="rId19" w:history="1">
+        <w:r>
+          <w:rPr>
+            <w:rStyle w:val="Hyperlink"/>
+          </w:rPr>
+          <w:t>Comparison of Actual vs. Predicted Sequences</w:t>
+        </w:r>
+      </w:hyperlink>
     </w:p>
     <w:p>
       <w:pPr>
@@ -7176,7 +7169,7 @@
                     </pic:cNvPicPr>
                   </pic:nvPicPr>
                   <pic:blipFill>
-                    <a:blip r:embed="rId17" cstate="print">
+                    <a:blip r:embed="rId20" cstate="print">
                       <a:extLst>
                         <a:ext uri="{28A0092B-C50C-407E-A947-70E740481C1C}">
                           <a14:useLocalDpi xmlns:a14="http://schemas.microsoft.com/office/drawing/2010/main" val="0"/>
@@ -7222,9 +7215,14 @@
         </w:rPr>
         <w:t xml:space="preserve">: </w:t>
       </w:r>
-      <w:r>
-        <w:t>Anomaly Detection in Sequences</w:t>
-      </w:r>
+      <w:hyperlink r:id="rId21" w:history="1">
+        <w:r>
+          <w:rPr>
+            <w:rStyle w:val="Hyperlink"/>
+          </w:rPr>
+          <w:t>Anomaly Detection in Sequences</w:t>
+        </w:r>
+      </w:hyperlink>
     </w:p>
     <w:p>
       <w:pPr>
@@ -7348,7 +7346,14 @@
         <w:rPr>
           <w:lang w:val="en-GB"/>
         </w:rPr>
-        <w:t xml:space="preserve">Although, it depends on a number of factors, like quantity (the more, the better) and quality of data, and hyperparameters used to tune and train model; more data should be used for training, and hyperparameters should be further tuned to find the most optimal setting for training to get the best results. We were using </w:t>
+        <w:t xml:space="preserve">Although, it depends on a number of factors, like quantity (the more, the better) and quality of data, and hyperparameters used to tune and train model; more data should be used for training, and hyperparameters should be further tuned to find the most optimal setting for training to get the best results. We </w:t>
+      </w:r>
+      <w:r>
+        <w:rPr>
+          <w:lang w:val="en-GB"/>
+        </w:rPr>
+        <w:lastRenderedPageBreak/>
+        <w:t xml:space="preserve">were using </w:t>
       </w:r>
       <w:proofErr w:type="gramStart"/>
       <w:r>
@@ -7370,7 +7375,6 @@
         <w:pStyle w:val="Heading1"/>
       </w:pPr>
       <w:r>
-        <w:lastRenderedPageBreak/>
         <w:t>Conclusion</w:t>
       </w:r>
     </w:p>
@@ -7399,7 +7403,13 @@
         <w:rPr>
           <w:lang w:val="en-US"/>
         </w:rPr>
-        <w:t>Our experiment demonstrated varying accuracy levels, influenced by computational limitations. Testing was conducted on a local machine with a smaller dataset due to resource and time constraints. Utilizing more powerful computing resources, such as cloud platforms, can enhance performance. Additionally, increasing the dataset size and fine-tuning hyperparameters can further optimize the model’s accuracy</w:t>
+        <w:t xml:space="preserve">Our experiment demonstrated varying accuracy levels, influenced by computational limitations. Testing was conducted on a local machine with a smaller dataset due to resource and time constraints. Utilizing more powerful computing resources, such as cloud platforms, can enhance </w:t>
+      </w:r>
+      <w:r>
+        <w:rPr>
+          <w:lang w:val="en-US"/>
+        </w:rPr>
+        <w:t>performance. Additionally, increasing the dataset size and fine-tuning hyperparameters can further optimize the model’s accuracy</w:t>
       </w:r>
       <w:r>
         <w:rPr>
@@ -7455,7 +7465,7 @@
       <w:r>
         <w:t xml:space="preserve">J. Wu, W. Zeng, and F. Yan, “Hierarchical Temporal Memory method for time-series-based anomaly detection,” Neurocomputing, vol. 273, pp. 535–546, Jan. 2018, doi: </w:t>
       </w:r>
-      <w:hyperlink r:id="rId18" w:history="1">
+      <w:hyperlink r:id="rId22" w:history="1">
         <w:r>
           <w:t>https://doi.org/10.1016/j.neucom.2017.08.026</w:t>
         </w:r>
@@ -8427,6 +8437,7 @@
         <w:strike w:val="0"/>
         <w:dstrike w:val="0"/>
         <w:vanish w:val="0"/>
+        <w:color w:val="000000"/>
         <w:sz w:val="16"/>
         <w:szCs w:val="16"/>
         <w:vertAlign w:val="superscript"/>
@@ -8438,11 +8449,6 @@
           <w14:prstDash w14:val="solid"/>
           <w14:bevel/>
         </w14:textOutline>
-        <w14:textFill>
-          <w14:solidFill>
-            <w14:srgbClr w14:val="000000"/>
-          </w14:solidFill>
-        </w14:textFill>
       </w:rPr>
     </w:lvl>
     <w:lvl w:ilvl="1" w:tplc="04090019">
@@ -9832,6 +9838,7 @@
   <w:style w:type="character" w:default="1" w:styleId="DefaultParagraphFont">
     <w:name w:val="Default Paragraph Font"/>
     <w:uiPriority w:val="1"/>
+    <w:semiHidden/>
     <w:unhideWhenUsed/>
   </w:style>
   <w:style w:type="table" w:default="1" w:styleId="TableNormal">
@@ -10383,6 +10390,15 @@
       <w:shd w:val="clear" w:color="auto" w:fill="E1DFDD"/>
     </w:rPr>
   </w:style>
+  <w:style w:type="character" w:styleId="FollowedHyperlink">
+    <w:name w:val="FollowedHyperlink"/>
+    <w:basedOn w:val="DefaultParagraphFont"/>
+    <w:rsid w:val="00EA5FAC"/>
+    <w:rPr>
+      <w:color w:val="954F72" w:themeColor="followedHyperlink"/>
+      <w:u w:val="single"/>
+    </w:rPr>
+  </w:style>
 </w:styles>
 </file>
 

</xml_diff>